<commit_message>
Jest User felület teszt javítása, tesztelési napló
Kijavítottam a hibás részeket a user fellület Jesttel való tesztelésébe, valamint hozzáadásra került a tesztelési naplóban a terminal-ba beirandó rész a működéshez, plusz a user felület tesztelési eredményei is.
</commit_message>
<xml_diff>
--- a/docs/BalatonBeautySalon_Jest_TesztelesiNaplo.docx
+++ b/docs/BalatonBeautySalon_Jest_TesztelesiNaplo.docx
@@ -253,6 +253,101 @@
       </w:r>
       <w:proofErr w:type="spellStart"/>
       <w:r>
+        <w:t>Terminálban</w:t>
+      </w:r>
+      <w:proofErr w:type="spellEnd"/>
+      <w:r>
+        <w:t xml:space="preserve">, </w:t>
+      </w:r>
+      <w:proofErr w:type="spellStart"/>
+      <w:r>
+        <w:t>hogy</w:t>
+      </w:r>
+      <w:proofErr w:type="spellEnd"/>
+      <w:r>
+        <w:t xml:space="preserve"> </w:t>
+      </w:r>
+      <w:proofErr w:type="spellStart"/>
+      <w:r>
+        <w:t>működjön</w:t>
+      </w:r>
+      <w:proofErr w:type="spellEnd"/>
+    </w:p>
+    <w:p>
+      <w:proofErr w:type="spellStart"/>
+      <w:r>
+        <w:t>npm</w:t>
+      </w:r>
+      <w:proofErr w:type="spellEnd"/>
+      <w:r>
+        <w:t xml:space="preserve"> install -D jest @testing-library/react @testing-library/jest-dom @testing-library/user-event </w:t>
+      </w:r>
+      <w:proofErr w:type="spellStart"/>
+      <w:r>
+        <w:t>jsdom</w:t>
+      </w:r>
+      <w:proofErr w:type="spellEnd"/>
+    </w:p>
+    <w:p>
+      <w:proofErr w:type="spellStart"/>
+      <w:r>
+        <w:t>npm</w:t>
+      </w:r>
+      <w:proofErr w:type="spellEnd"/>
+      <w:r>
+        <w:t xml:space="preserve"> install -D jest-environment-</w:t>
+      </w:r>
+      <w:proofErr w:type="spellStart"/>
+      <w:r>
+        <w:t>jsdom</w:t>
+      </w:r>
+      <w:proofErr w:type="spellEnd"/>
+    </w:p>
+    <w:p>
+      <w:proofErr w:type="spellStart"/>
+      <w:r>
+        <w:t>npm</w:t>
+      </w:r>
+      <w:proofErr w:type="spellEnd"/>
+      <w:r>
+        <w:t xml:space="preserve"> install -D babel-</w:t>
+      </w:r>
+      <w:proofErr w:type="gramStart"/>
+      <w:r>
+        <w:t>jest @</w:t>
+      </w:r>
+      <w:proofErr w:type="gramEnd"/>
+      <w:r>
+        <w:t>babel/preset-</w:t>
+      </w:r>
+      <w:proofErr w:type="gramStart"/>
+      <w:r>
+        <w:t>env @</w:t>
+      </w:r>
+      <w:proofErr w:type="gramEnd"/>
+      <w:r>
+        <w:t>babel/preset-react</w:t>
+      </w:r>
+    </w:p>
+    <w:p>
+      <w:proofErr w:type="spellStart"/>
+      <w:r>
+        <w:t>npm</w:t>
+      </w:r>
+      <w:proofErr w:type="spellEnd"/>
+      <w:r>
+        <w:t xml:space="preserve"> install -D identity-obj-proxy</w:t>
+      </w:r>
+    </w:p>
+    <w:p>
+      <w:pPr>
+        <w:pStyle w:val="Cmsor2"/>
+      </w:pPr>
+      <w:r>
+        <w:t xml:space="preserve">3. </w:t>
+      </w:r>
+      <w:proofErr w:type="spellStart"/>
+      <w:r>
         <w:t>Tesztelt</w:t>
       </w:r>
       <w:proofErr w:type="spellEnd"/>
@@ -532,6 +627,7 @@
         <w:pStyle w:val="Cmsor3"/>
       </w:pPr>
       <w:r>
+        <w:lastRenderedPageBreak/>
         <w:t xml:space="preserve">Services </w:t>
       </w:r>
       <w:proofErr w:type="spellStart"/>
@@ -862,6 +958,7 @@
     </w:p>
     <w:p>
       <w:r>
+        <w:lastRenderedPageBreak/>
         <w:t>- Validáció működik (üres eset)</w:t>
       </w:r>
     </w:p>
@@ -885,7 +982,6 @@
         <w:pStyle w:val="Cmsor3"/>
       </w:pPr>
       <w:r>
-        <w:lastRenderedPageBreak/>
         <w:t>EditTreatmentModal</w:t>
       </w:r>
     </w:p>
@@ -1044,6 +1140,7 @@
     </w:p>
     <w:p>
       <w:r>
+        <w:lastRenderedPageBreak/>
         <w:t>- Logout működik</w:t>
       </w:r>
     </w:p>
@@ -1091,7 +1188,6 @@
         <w:pStyle w:val="Cmsor3"/>
       </w:pPr>
       <w:r>
-        <w:lastRenderedPageBreak/>
         <w:t>AdminLayout</w:t>
       </w:r>
     </w:p>
@@ -1118,167 +1214,1362 @@
       </w:r>
       <w:proofErr w:type="spellEnd"/>
     </w:p>
+    <w:p/>
     <w:p>
       <w:pPr>
-        <w:pStyle w:val="Cmsor2"/>
-      </w:pPr>
-      <w:r>
-        <w:t xml:space="preserve">5. </w:t>
-      </w:r>
-      <w:proofErr w:type="spellStart"/>
-      <w:r>
-        <w:t>Tesztelési</w:t>
-      </w:r>
-      <w:proofErr w:type="spellEnd"/>
-      <w:r>
-        <w:t xml:space="preserve"> </w:t>
-      </w:r>
-      <w:proofErr w:type="spellStart"/>
-      <w:r>
-        <w:t>eredmények</w:t>
-      </w:r>
-      <w:proofErr w:type="spellEnd"/>
+        <w:rPr>
+          <w:b/>
+          <w:bCs/>
+          <w:lang w:val="hu-HU"/>
+        </w:rPr>
+      </w:pPr>
+      <w:r>
+        <w:rPr>
+          <w:b/>
+          <w:bCs/>
+          <w:lang w:val="hu-HU"/>
+        </w:rPr>
+        <w:t xml:space="preserve">7. Tesztelt </w:t>
+      </w:r>
+      <w:proofErr w:type="spellStart"/>
+      <w:r>
+        <w:rPr>
+          <w:b/>
+          <w:bCs/>
+          <w:lang w:val="hu-HU"/>
+        </w:rPr>
+        <w:t>user</w:t>
+      </w:r>
+      <w:proofErr w:type="spellEnd"/>
+      <w:r>
+        <w:rPr>
+          <w:b/>
+          <w:bCs/>
+          <w:lang w:val="hu-HU"/>
+        </w:rPr>
+        <w:t xml:space="preserve"> oldalak és tesztesetek</w:t>
+      </w:r>
     </w:p>
     <w:p>
-      <w:r>
-        <w:t xml:space="preserve">A </w:t>
-      </w:r>
-      <w:proofErr w:type="spellStart"/>
-      <w:r>
-        <w:t>tesztek</w:t>
-      </w:r>
-      <w:proofErr w:type="spellEnd"/>
-      <w:r>
-        <w:t xml:space="preserve"> </w:t>
-      </w:r>
-      <w:proofErr w:type="spellStart"/>
-      <w:r>
-        <w:t>futtatása</w:t>
-      </w:r>
-      <w:proofErr w:type="spellEnd"/>
-      <w:r>
-        <w:t xml:space="preserve"> </w:t>
-      </w:r>
-      <w:proofErr w:type="spellStart"/>
-      <w:r>
-        <w:t>során</w:t>
-      </w:r>
-      <w:proofErr w:type="spellEnd"/>
-      <w:r>
-        <w:t xml:space="preserve"> </w:t>
-      </w:r>
-      <w:proofErr w:type="spellStart"/>
-      <w:r>
-        <w:t>minden</w:t>
-      </w:r>
-      <w:proofErr w:type="spellEnd"/>
-      <w:r>
-        <w:t xml:space="preserve"> </w:t>
-      </w:r>
-      <w:proofErr w:type="spellStart"/>
-      <w:r>
-        <w:t>teszteset</w:t>
-      </w:r>
-      <w:proofErr w:type="spellEnd"/>
-      <w:r>
-        <w:t xml:space="preserve"> </w:t>
-      </w:r>
-      <w:proofErr w:type="spellStart"/>
-      <w:r>
-        <w:t>sikeresen</w:t>
-      </w:r>
-      <w:proofErr w:type="spellEnd"/>
-      <w:r>
-        <w:t xml:space="preserve"> </w:t>
-      </w:r>
-      <w:proofErr w:type="spellStart"/>
-      <w:r>
-        <w:t>lefutott</w:t>
-      </w:r>
-      <w:proofErr w:type="spellEnd"/>
-      <w:r>
-        <w:t xml:space="preserve">. A </w:t>
-      </w:r>
-      <w:proofErr w:type="spellStart"/>
-      <w:r>
-        <w:t>mockolt</w:t>
-      </w:r>
-      <w:proofErr w:type="spellEnd"/>
-      <w:r>
-        <w:t xml:space="preserve"> API </w:t>
-      </w:r>
-      <w:proofErr w:type="spellStart"/>
-      <w:r>
-        <w:t>hívások</w:t>
-      </w:r>
-      <w:proofErr w:type="spellEnd"/>
-      <w:r>
-        <w:t xml:space="preserve"> </w:t>
-      </w:r>
-      <w:proofErr w:type="spellStart"/>
-      <w:r>
-        <w:t>segítségével</w:t>
-      </w:r>
-      <w:proofErr w:type="spellEnd"/>
-      <w:r>
-        <w:t xml:space="preserve"> </w:t>
-      </w:r>
-      <w:proofErr w:type="spellStart"/>
-      <w:r>
-        <w:t>ellenőriztem</w:t>
-      </w:r>
-      <w:proofErr w:type="spellEnd"/>
-      <w:r>
-        <w:t xml:space="preserve"> </w:t>
-      </w:r>
-      <w:proofErr w:type="spellStart"/>
-      <w:r>
-        <w:t>az</w:t>
-      </w:r>
-      <w:proofErr w:type="spellEnd"/>
-      <w:r>
-        <w:t xml:space="preserve"> </w:t>
-      </w:r>
-      <w:proofErr w:type="spellStart"/>
-      <w:r>
-        <w:t>aszinkron</w:t>
-      </w:r>
-      <w:proofErr w:type="spellEnd"/>
-      <w:r>
-        <w:t xml:space="preserve"> </w:t>
-      </w:r>
-      <w:proofErr w:type="spellStart"/>
-      <w:r>
-        <w:t>működést</w:t>
-      </w:r>
-      <w:proofErr w:type="spellEnd"/>
-      <w:r>
-        <w:t xml:space="preserve"> </w:t>
-      </w:r>
-      <w:proofErr w:type="spellStart"/>
-      <w:r>
-        <w:t>és</w:t>
-      </w:r>
-      <w:proofErr w:type="spellEnd"/>
-      <w:r>
-        <w:t xml:space="preserve"> a </w:t>
-      </w:r>
-      <w:proofErr w:type="spellStart"/>
-      <w:r>
-        <w:t>hibakezelést</w:t>
-      </w:r>
-      <w:proofErr w:type="spellEnd"/>
-      <w:r>
-        <w:t xml:space="preserve"> is.</w:t>
+      <w:pPr>
+        <w:pStyle w:val="Cmsor3"/>
+      </w:pPr>
+      <w:r>
+        <w:t>Login oldal (felhasználói bejelentkezés)</w:t>
       </w:r>
     </w:p>
     <w:p>
-      <w:r>
+      <w:pPr>
+        <w:tabs>
+          <w:tab w:val="num" w:pos="720"/>
+        </w:tabs>
+      </w:pPr>
+      <w:r>
+        <w:t xml:space="preserve">- </w:t>
+      </w:r>
+      <w:r>
+        <w:t xml:space="preserve">Login </w:t>
+      </w:r>
+      <w:proofErr w:type="gramStart"/>
+      <w:r>
+        <w:t>form</w:t>
+      </w:r>
+      <w:proofErr w:type="gramEnd"/>
+      <w:r>
+        <w:t xml:space="preserve"> </w:t>
+      </w:r>
+      <w:proofErr w:type="spellStart"/>
+      <w:r>
+        <w:t>megjelenik</w:t>
+      </w:r>
+      <w:proofErr w:type="spellEnd"/>
+      <w:r>
+        <w:t xml:space="preserve"> </w:t>
+      </w:r>
+    </w:p>
+    <w:p>
+      <w:pPr>
+        <w:tabs>
+          <w:tab w:val="num" w:pos="720"/>
+        </w:tabs>
+      </w:pPr>
+      <w:r>
+        <w:t xml:space="preserve">- </w:t>
+      </w:r>
+      <w:r>
+        <w:t xml:space="preserve">Email </w:t>
+      </w:r>
+      <w:proofErr w:type="spellStart"/>
+      <w:r>
+        <w:t>és</w:t>
+      </w:r>
+      <w:proofErr w:type="spellEnd"/>
+      <w:r>
+        <w:t xml:space="preserve"> </w:t>
+      </w:r>
+      <w:proofErr w:type="spellStart"/>
+      <w:r>
+        <w:t>jelszó</w:t>
+      </w:r>
+      <w:proofErr w:type="spellEnd"/>
+      <w:r>
+        <w:t xml:space="preserve"> </w:t>
+      </w:r>
+      <w:proofErr w:type="spellStart"/>
+      <w:r>
+        <w:t>mezők</w:t>
+      </w:r>
+      <w:proofErr w:type="spellEnd"/>
+      <w:r>
+        <w:t xml:space="preserve"> </w:t>
+      </w:r>
+      <w:proofErr w:type="spellStart"/>
+      <w:r>
+        <w:t>megjelennek</w:t>
+      </w:r>
+      <w:proofErr w:type="spellEnd"/>
+      <w:r>
+        <w:t xml:space="preserve"> </w:t>
+      </w:r>
+    </w:p>
+    <w:p>
+      <w:pPr>
+        <w:tabs>
+          <w:tab w:val="num" w:pos="720"/>
+        </w:tabs>
+      </w:pPr>
+      <w:r>
+        <w:t xml:space="preserve">- </w:t>
+      </w:r>
+      <w:proofErr w:type="spellStart"/>
+      <w:r>
+        <w:t>Sikeres</w:t>
+      </w:r>
+      <w:proofErr w:type="spellEnd"/>
+      <w:r>
+        <w:t xml:space="preserve"> </w:t>
+      </w:r>
+      <w:proofErr w:type="spellStart"/>
+      <w:r>
+        <w:t>bejelentkezés</w:t>
+      </w:r>
+      <w:proofErr w:type="spellEnd"/>
+      <w:r>
+        <w:t xml:space="preserve"> token </w:t>
+      </w:r>
+      <w:proofErr w:type="spellStart"/>
+      <w:r>
+        <w:t>mentése</w:t>
+      </w:r>
+      <w:proofErr w:type="spellEnd"/>
+      <w:r>
+        <w:t xml:space="preserve"> </w:t>
+      </w:r>
+      <w:proofErr w:type="spellStart"/>
+      <w:r>
+        <w:t>localStorage</w:t>
+      </w:r>
+      <w:proofErr w:type="spellEnd"/>
+      <w:r>
+        <w:t xml:space="preserve">-be </w:t>
+      </w:r>
+    </w:p>
+    <w:p>
+      <w:pPr>
+        <w:tabs>
+          <w:tab w:val="num" w:pos="720"/>
+        </w:tabs>
+      </w:pPr>
+      <w:r>
+        <w:t xml:space="preserve">- </w:t>
+      </w:r>
+      <w:proofErr w:type="spellStart"/>
+      <w:r>
+        <w:t>Navigáció</w:t>
+      </w:r>
+      <w:proofErr w:type="spellEnd"/>
+      <w:r>
+        <w:t xml:space="preserve"> user </w:t>
+      </w:r>
+      <w:proofErr w:type="spellStart"/>
+      <w:r>
+        <w:t>főoldalra</w:t>
+      </w:r>
+      <w:proofErr w:type="spellEnd"/>
+      <w:r>
+        <w:t xml:space="preserve"> </w:t>
+      </w:r>
+      <w:proofErr w:type="spellStart"/>
+      <w:r>
+        <w:t>sikeres</w:t>
+      </w:r>
+      <w:proofErr w:type="spellEnd"/>
+      <w:r>
+        <w:t xml:space="preserve"> login után </w:t>
+      </w:r>
+    </w:p>
+    <w:p>
+      <w:pPr>
+        <w:tabs>
+          <w:tab w:val="num" w:pos="720"/>
+        </w:tabs>
+      </w:pPr>
+      <w:r>
+        <w:t xml:space="preserve">- </w:t>
+      </w:r>
+      <w:proofErr w:type="spellStart"/>
+      <w:r>
+        <w:t>Hibás</w:t>
+      </w:r>
+      <w:proofErr w:type="spellEnd"/>
+      <w:r>
+        <w:t xml:space="preserve"> </w:t>
+      </w:r>
+      <w:proofErr w:type="spellStart"/>
+      <w:r>
+        <w:t>bejelentkezés</w:t>
+      </w:r>
+      <w:proofErr w:type="spellEnd"/>
+      <w:r>
+        <w:t xml:space="preserve"> </w:t>
+      </w:r>
+      <w:proofErr w:type="spellStart"/>
+      <w:r>
+        <w:t>esetén</w:t>
+      </w:r>
+      <w:proofErr w:type="spellEnd"/>
+      <w:r>
+        <w:t xml:space="preserve"> </w:t>
+      </w:r>
+      <w:proofErr w:type="spellStart"/>
+      <w:r>
+        <w:t>hibaüzenet</w:t>
+      </w:r>
+      <w:proofErr w:type="spellEnd"/>
+      <w:r>
+        <w:t xml:space="preserve"> </w:t>
+      </w:r>
+      <w:proofErr w:type="spellStart"/>
+      <w:r>
+        <w:t>jelenik</w:t>
+      </w:r>
+      <w:proofErr w:type="spellEnd"/>
+      <w:r>
+        <w:t xml:space="preserve"> meg </w:t>
+      </w:r>
+    </w:p>
+    <w:p>
+      <w:pPr>
+        <w:tabs>
+          <w:tab w:val="num" w:pos="720"/>
+        </w:tabs>
+      </w:pPr>
+      <w:r>
+        <w:t xml:space="preserve">- </w:t>
+      </w:r>
+      <w:proofErr w:type="spellStart"/>
+      <w:r>
+        <w:t>Elfelejtett</w:t>
+      </w:r>
+      <w:proofErr w:type="spellEnd"/>
+      <w:r>
+        <w:t xml:space="preserve"> </w:t>
+      </w:r>
+      <w:proofErr w:type="spellStart"/>
+      <w:r>
+        <w:t>jelszó</w:t>
+      </w:r>
+      <w:proofErr w:type="spellEnd"/>
+      <w:r>
+        <w:t xml:space="preserve"> modal </w:t>
+      </w:r>
+      <w:proofErr w:type="spellStart"/>
+      <w:r>
+        <w:t>megnyílik</w:t>
+      </w:r>
+      <w:proofErr w:type="spellEnd"/>
+      <w:r>
+        <w:t xml:space="preserve"> </w:t>
+      </w:r>
+    </w:p>
+    <w:p>
+      <w:pPr>
+        <w:tabs>
+          <w:tab w:val="num" w:pos="720"/>
+        </w:tabs>
+      </w:pPr>
+      <w:r>
+        <w:t xml:space="preserve">- </w:t>
+      </w:r>
+      <w:r>
+        <w:t xml:space="preserve">Reset email </w:t>
+      </w:r>
+      <w:proofErr w:type="spellStart"/>
+      <w:r>
+        <w:t>küldése</w:t>
+      </w:r>
+      <w:proofErr w:type="spellEnd"/>
+      <w:r>
+        <w:t xml:space="preserve"> API hívással működik </w:t>
+      </w:r>
+    </w:p>
+    <w:p>
+      <w:pPr>
+        <w:tabs>
+          <w:tab w:val="num" w:pos="720"/>
+        </w:tabs>
+      </w:pPr>
+      <w:r>
+        <w:t xml:space="preserve">- </w:t>
+      </w:r>
+      <w:proofErr w:type="spellStart"/>
+      <w:r>
+        <w:t>Jelszó</w:t>
+      </w:r>
+      <w:proofErr w:type="spellEnd"/>
+      <w:r>
+        <w:t xml:space="preserve"> </w:t>
+      </w:r>
+      <w:proofErr w:type="spellStart"/>
+      <w:r>
+        <w:t>láthatóság</w:t>
+      </w:r>
+      <w:proofErr w:type="spellEnd"/>
+      <w:r>
+        <w:t xml:space="preserve"> toggle </w:t>
+      </w:r>
+      <w:proofErr w:type="spellStart"/>
+      <w:r>
+        <w:t>működik</w:t>
+      </w:r>
+      <w:proofErr w:type="spellEnd"/>
+      <w:r>
+        <w:t xml:space="preserve"> </w:t>
+      </w:r>
+    </w:p>
+    <w:p>
+      <w:pPr>
+        <w:pStyle w:val="Cmsor3"/>
+      </w:pPr>
+      <w:proofErr w:type="spellStart"/>
+      <w:r>
+        <w:t>ResetPassword</w:t>
+      </w:r>
+      <w:proofErr w:type="spellEnd"/>
+      <w:r>
+        <w:t xml:space="preserve"> oldal</w:t>
+      </w:r>
+    </w:p>
+    <w:p>
+      <w:pPr>
+        <w:tabs>
+          <w:tab w:val="num" w:pos="720"/>
+        </w:tabs>
+      </w:pPr>
+      <w:r>
+        <w:t xml:space="preserve">- </w:t>
+      </w:r>
+      <w:proofErr w:type="spellStart"/>
+      <w:r>
+        <w:t>Jelszó</w:t>
+      </w:r>
+      <w:proofErr w:type="spellEnd"/>
+      <w:r>
+        <w:t xml:space="preserve"> </w:t>
+      </w:r>
+      <w:proofErr w:type="spellStart"/>
+      <w:r>
+        <w:t>és</w:t>
+      </w:r>
+      <w:proofErr w:type="spellEnd"/>
+      <w:r>
+        <w:t xml:space="preserve"> </w:t>
+      </w:r>
+      <w:proofErr w:type="spellStart"/>
+      <w:r>
+        <w:t>jelszó</w:t>
+      </w:r>
+      <w:proofErr w:type="spellEnd"/>
+      <w:r>
+        <w:t xml:space="preserve"> </w:t>
+      </w:r>
+      <w:proofErr w:type="spellStart"/>
+      <w:r>
+        <w:t>megerősítés</w:t>
+      </w:r>
+      <w:proofErr w:type="spellEnd"/>
+      <w:r>
+        <w:t xml:space="preserve"> </w:t>
+      </w:r>
+      <w:proofErr w:type="spellStart"/>
+      <w:r>
+        <w:t>mezők</w:t>
+      </w:r>
+      <w:proofErr w:type="spellEnd"/>
+      <w:r>
+        <w:t xml:space="preserve"> </w:t>
+      </w:r>
+      <w:proofErr w:type="spellStart"/>
+      <w:r>
+        <w:t>megjelennek</w:t>
+      </w:r>
+      <w:proofErr w:type="spellEnd"/>
+      <w:r>
+        <w:t xml:space="preserve"> </w:t>
+      </w:r>
+    </w:p>
+    <w:p>
+      <w:pPr>
+        <w:tabs>
+          <w:tab w:val="num" w:pos="720"/>
+        </w:tabs>
+      </w:pPr>
+      <w:r>
+        <w:t xml:space="preserve">- </w:t>
+      </w:r>
+      <w:proofErr w:type="spellStart"/>
+      <w:r>
+        <w:t>Validáció</w:t>
+      </w:r>
+      <w:proofErr w:type="spellEnd"/>
+      <w:r>
+        <w:t xml:space="preserve"> </w:t>
+      </w:r>
+      <w:proofErr w:type="spellStart"/>
+      <w:r>
+        <w:t>működik</w:t>
+      </w:r>
+      <w:proofErr w:type="spellEnd"/>
+      <w:r>
+        <w:t xml:space="preserve"> </w:t>
+      </w:r>
+      <w:proofErr w:type="spellStart"/>
+      <w:r>
+        <w:t>ha</w:t>
+      </w:r>
+      <w:proofErr w:type="spellEnd"/>
+      <w:r>
+        <w:t xml:space="preserve"> a két jelszó nem egyezik </w:t>
+      </w:r>
+    </w:p>
+    <w:p>
+      <w:pPr>
+        <w:tabs>
+          <w:tab w:val="num" w:pos="720"/>
+        </w:tabs>
+      </w:pPr>
+      <w:r>
+        <w:t xml:space="preserve">- </w:t>
+      </w:r>
+      <w:r>
+        <w:t xml:space="preserve">API hívás elküldése helyes adatokkal </w:t>
+      </w:r>
+    </w:p>
+    <w:p>
+      <w:pPr>
+        <w:tabs>
+          <w:tab w:val="num" w:pos="720"/>
+        </w:tabs>
+      </w:pPr>
+      <w:r>
+        <w:t xml:space="preserve">- </w:t>
+      </w:r>
+      <w:proofErr w:type="spellStart"/>
+      <w:r>
+        <w:t>Sikeres</w:t>
+      </w:r>
+      <w:proofErr w:type="spellEnd"/>
+      <w:r>
+        <w:t xml:space="preserve"> </w:t>
+      </w:r>
+      <w:proofErr w:type="spellStart"/>
+      <w:r>
+        <w:t>jelszó</w:t>
+      </w:r>
+      <w:proofErr w:type="spellEnd"/>
+      <w:r>
+        <w:t xml:space="preserve"> </w:t>
+      </w:r>
+      <w:proofErr w:type="spellStart"/>
+      <w:r>
+        <w:t>módosítás</w:t>
+      </w:r>
+      <w:proofErr w:type="spellEnd"/>
+      <w:r>
+        <w:t xml:space="preserve"> után siker üzenet jelenik meg </w:t>
+      </w:r>
+    </w:p>
+    <w:p>
+      <w:pPr>
+        <w:tabs>
+          <w:tab w:val="num" w:pos="720"/>
+        </w:tabs>
+      </w:pPr>
+      <w:r>
+        <w:t xml:space="preserve">- </w:t>
+      </w:r>
+      <w:proofErr w:type="spellStart"/>
+      <w:r>
+        <w:t>Átirányítás</w:t>
+      </w:r>
+      <w:proofErr w:type="spellEnd"/>
+      <w:r>
+        <w:t xml:space="preserve"> login oldalra sikeres módosítás után </w:t>
+      </w:r>
+    </w:p>
+    <w:p>
+      <w:pPr>
+        <w:tabs>
+          <w:tab w:val="num" w:pos="720"/>
+        </w:tabs>
+      </w:pPr>
+      <w:r>
+        <w:t xml:space="preserve">- </w:t>
+      </w:r>
+      <w:r>
+        <w:t xml:space="preserve">Backend </w:t>
+      </w:r>
+      <w:proofErr w:type="spellStart"/>
+      <w:r>
+        <w:t>hibaüzenet</w:t>
+      </w:r>
+      <w:proofErr w:type="spellEnd"/>
+      <w:r>
+        <w:t xml:space="preserve"> </w:t>
+      </w:r>
+      <w:proofErr w:type="spellStart"/>
+      <w:r>
+        <w:t>megjelenik</w:t>
+      </w:r>
+      <w:proofErr w:type="spellEnd"/>
+      <w:r>
+        <w:t xml:space="preserve"> </w:t>
+      </w:r>
+    </w:p>
+    <w:p>
+      <w:pPr>
+        <w:pStyle w:val="Cmsor3"/>
+      </w:pPr>
+      <w:proofErr w:type="spellStart"/>
+      <w:r>
+        <w:t>Profile</w:t>
+      </w:r>
+      <w:proofErr w:type="spellEnd"/>
+      <w:r>
+        <w:t xml:space="preserve"> oldal</w:t>
+      </w:r>
+    </w:p>
+    <w:p>
+      <w:pPr>
+        <w:tabs>
+          <w:tab w:val="num" w:pos="720"/>
+        </w:tabs>
+      </w:pPr>
+      <w:r>
+        <w:t xml:space="preserve">- </w:t>
+      </w:r>
+      <w:proofErr w:type="spellStart"/>
+      <w:r>
+        <w:t>Felhasználó</w:t>
+      </w:r>
+      <w:proofErr w:type="spellEnd"/>
+      <w:r>
+        <w:t xml:space="preserve"> adatok betöltése API-</w:t>
+      </w:r>
+      <w:proofErr w:type="spellStart"/>
+      <w:r>
+        <w:t>ból</w:t>
+      </w:r>
+      <w:proofErr w:type="spellEnd"/>
+      <w:r>
+        <w:t xml:space="preserve"> </w:t>
+      </w:r>
+    </w:p>
+    <w:p>
+      <w:pPr>
+        <w:tabs>
+          <w:tab w:val="num" w:pos="720"/>
+        </w:tabs>
+      </w:pPr>
+      <w:r>
+        <w:t xml:space="preserve">- </w:t>
+      </w:r>
+      <w:proofErr w:type="spellStart"/>
+      <w:r>
+        <w:t>Név</w:t>
+      </w:r>
+      <w:proofErr w:type="spellEnd"/>
+      <w:r>
+        <w:t xml:space="preserve">, email </w:t>
+      </w:r>
+      <w:proofErr w:type="spellStart"/>
+      <w:r>
+        <w:t>és</w:t>
+      </w:r>
+      <w:proofErr w:type="spellEnd"/>
+      <w:r>
+        <w:t xml:space="preserve"> telefonszám megjelenik </w:t>
+      </w:r>
+    </w:p>
+    <w:p>
+      <w:pPr>
+        <w:tabs>
+          <w:tab w:val="num" w:pos="720"/>
+        </w:tabs>
+      </w:pPr>
+      <w:r>
+        <w:t xml:space="preserve">- </w:t>
+      </w:r>
+      <w:proofErr w:type="spellStart"/>
+      <w:r>
+        <w:t>Jelszó</w:t>
+      </w:r>
+      <w:proofErr w:type="spellEnd"/>
+      <w:r>
+        <w:t xml:space="preserve"> </w:t>
+      </w:r>
+      <w:proofErr w:type="spellStart"/>
+      <w:r>
+        <w:t>módosítás</w:t>
+      </w:r>
+      <w:proofErr w:type="spellEnd"/>
+      <w:r>
+        <w:t xml:space="preserve"> </w:t>
+      </w:r>
+      <w:proofErr w:type="spellStart"/>
+      <w:r>
+        <w:t>validáció</w:t>
+      </w:r>
+      <w:proofErr w:type="spellEnd"/>
+      <w:r>
+        <w:t xml:space="preserve"> működik </w:t>
+      </w:r>
+    </w:p>
+    <w:p>
+      <w:pPr>
+        <w:tabs>
+          <w:tab w:val="num" w:pos="720"/>
+        </w:tabs>
+      </w:pPr>
+      <w:r>
+        <w:t xml:space="preserve">- </w:t>
+      </w:r>
+      <w:r>
+        <w:t xml:space="preserve">Hiba ha </w:t>
+      </w:r>
+      <w:proofErr w:type="spellStart"/>
+      <w:r>
+        <w:t>mezők</w:t>
+      </w:r>
+      <w:proofErr w:type="spellEnd"/>
+      <w:r>
+        <w:t xml:space="preserve"> üresek </w:t>
+      </w:r>
+    </w:p>
+    <w:p>
+      <w:pPr>
+        <w:tabs>
+          <w:tab w:val="num" w:pos="720"/>
+        </w:tabs>
+      </w:pPr>
+      <w:r>
+        <w:lastRenderedPageBreak/>
+        <w:t xml:space="preserve">- </w:t>
+      </w:r>
+      <w:r>
+        <w:t xml:space="preserve">Hiba ha új jelszavak nem egyeznek </w:t>
+      </w:r>
+    </w:p>
+    <w:p>
+      <w:pPr>
+        <w:tabs>
+          <w:tab w:val="num" w:pos="720"/>
+        </w:tabs>
+      </w:pPr>
+      <w:r>
+        <w:t xml:space="preserve">- </w:t>
+      </w:r>
+      <w:proofErr w:type="spellStart"/>
+      <w:r>
+        <w:t>Sikeres</w:t>
+      </w:r>
+      <w:proofErr w:type="spellEnd"/>
+      <w:r>
+        <w:t xml:space="preserve"> </w:t>
+      </w:r>
+      <w:proofErr w:type="spellStart"/>
+      <w:r>
+        <w:t>jelszó</w:t>
+      </w:r>
+      <w:proofErr w:type="spellEnd"/>
+      <w:r>
+        <w:t xml:space="preserve"> </w:t>
+      </w:r>
+      <w:proofErr w:type="spellStart"/>
+      <w:r>
+        <w:t>módosítás</w:t>
+      </w:r>
+      <w:proofErr w:type="spellEnd"/>
+      <w:r>
+        <w:t xml:space="preserve"> API hívással </w:t>
+      </w:r>
+    </w:p>
+    <w:p>
+      <w:pPr>
+        <w:tabs>
+          <w:tab w:val="num" w:pos="720"/>
+        </w:tabs>
+      </w:pPr>
+      <w:r>
+        <w:t xml:space="preserve">- </w:t>
+      </w:r>
+      <w:proofErr w:type="spellStart"/>
+      <w:r>
+        <w:t>Navigáció</w:t>
+      </w:r>
+      <w:proofErr w:type="spellEnd"/>
+      <w:r>
+        <w:t xml:space="preserve"> login oldalra jelszó módosítás után </w:t>
+      </w:r>
+    </w:p>
+    <w:p>
+      <w:pPr>
+        <w:pStyle w:val="Cmsor3"/>
+      </w:pPr>
+      <w:proofErr w:type="spellStart"/>
+      <w:r>
+        <w:t>UserHome</w:t>
+      </w:r>
+      <w:proofErr w:type="spellEnd"/>
+      <w:r>
+        <w:t xml:space="preserve"> oldal</w:t>
+      </w:r>
+    </w:p>
+    <w:p>
+      <w:pPr>
+        <w:tabs>
+          <w:tab w:val="num" w:pos="720"/>
+        </w:tabs>
+      </w:pPr>
+      <w:r>
+        <w:t xml:space="preserve">- </w:t>
+      </w:r>
+      <w:proofErr w:type="spellStart"/>
+      <w:r>
+        <w:t>Üdvözlő</w:t>
+      </w:r>
+      <w:proofErr w:type="spellEnd"/>
+      <w:r>
+        <w:t xml:space="preserve"> </w:t>
+      </w:r>
+      <w:proofErr w:type="spellStart"/>
+      <w:r>
+        <w:t>szöveg</w:t>
+      </w:r>
+      <w:proofErr w:type="spellEnd"/>
+      <w:r>
+        <w:t xml:space="preserve"> </w:t>
+      </w:r>
+      <w:proofErr w:type="spellStart"/>
+      <w:r>
+        <w:t>megjelenik</w:t>
+      </w:r>
+      <w:proofErr w:type="spellEnd"/>
+      <w:r>
+        <w:t xml:space="preserve"> </w:t>
+      </w:r>
+    </w:p>
+    <w:p>
+      <w:pPr>
+        <w:tabs>
+          <w:tab w:val="num" w:pos="720"/>
+        </w:tabs>
+      </w:pPr>
+      <w:r>
+        <w:t xml:space="preserve">- </w:t>
+      </w:r>
+      <w:proofErr w:type="spellStart"/>
+      <w:r>
+        <w:t>Statisztikai</w:t>
+      </w:r>
+      <w:proofErr w:type="spellEnd"/>
+      <w:r>
+        <w:t xml:space="preserve"> adatok betöltődnek API-</w:t>
+      </w:r>
+      <w:proofErr w:type="spellStart"/>
+      <w:r>
+        <w:t>ból</w:t>
+      </w:r>
+      <w:proofErr w:type="spellEnd"/>
+      <w:r>
+        <w:t xml:space="preserve"> </w:t>
+      </w:r>
+    </w:p>
+    <w:p>
+      <w:pPr>
+        <w:tabs>
+          <w:tab w:val="num" w:pos="720"/>
+        </w:tabs>
+      </w:pPr>
+      <w:r>
+        <w:t xml:space="preserve">- </w:t>
+      </w:r>
+      <w:proofErr w:type="spellStart"/>
+      <w:r>
+        <w:t>Utolsó</w:t>
+      </w:r>
+      <w:proofErr w:type="spellEnd"/>
+      <w:r>
+        <w:t xml:space="preserve"> </w:t>
+      </w:r>
+      <w:proofErr w:type="spellStart"/>
+      <w:r>
+        <w:t>kezelés</w:t>
+      </w:r>
+      <w:proofErr w:type="spellEnd"/>
+      <w:r>
+        <w:t xml:space="preserve"> </w:t>
+      </w:r>
+      <w:proofErr w:type="spellStart"/>
+      <w:r>
+        <w:t>megjelenik</w:t>
+      </w:r>
+      <w:proofErr w:type="spellEnd"/>
+      <w:r>
+        <w:t xml:space="preserve"> </w:t>
+      </w:r>
+    </w:p>
+    <w:p>
+      <w:pPr>
+        <w:tabs>
+          <w:tab w:val="num" w:pos="720"/>
+        </w:tabs>
+      </w:pPr>
+      <w:r>
+        <w:t xml:space="preserve">- </w:t>
+      </w:r>
+      <w:proofErr w:type="spellStart"/>
+      <w:r>
+        <w:t>Kezelés</w:t>
+      </w:r>
+      <w:proofErr w:type="spellEnd"/>
+      <w:r>
+        <w:t xml:space="preserve"> megtekintése </w:t>
+      </w:r>
+      <w:proofErr w:type="spellStart"/>
+      <w:r>
+        <w:t>modal</w:t>
+      </w:r>
+      <w:proofErr w:type="spellEnd"/>
+      <w:r>
+        <w:t xml:space="preserve"> megnyitása </w:t>
+      </w:r>
+    </w:p>
+    <w:p>
+      <w:pPr>
+        <w:tabs>
+          <w:tab w:val="num" w:pos="720"/>
+        </w:tabs>
+      </w:pPr>
+      <w:r>
+        <w:t xml:space="preserve">- </w:t>
+      </w:r>
+      <w:r>
+        <w:t xml:space="preserve">Modal </w:t>
+      </w:r>
+      <w:proofErr w:type="spellStart"/>
+      <w:r>
+        <w:t>navigál</w:t>
+      </w:r>
+      <w:proofErr w:type="spellEnd"/>
+      <w:r>
+        <w:t xml:space="preserve"> treatments </w:t>
+      </w:r>
+      <w:proofErr w:type="spellStart"/>
+      <w:r>
+        <w:t>oldalra</w:t>
+      </w:r>
+      <w:proofErr w:type="spellEnd"/>
+      <w:r>
+        <w:t xml:space="preserve"> </w:t>
+      </w:r>
+    </w:p>
+    <w:p>
+      <w:pPr>
+        <w:tabs>
+          <w:tab w:val="num" w:pos="720"/>
+        </w:tabs>
+      </w:pPr>
+      <w:r>
+        <w:t xml:space="preserve">- </w:t>
+      </w:r>
+      <w:proofErr w:type="spellStart"/>
+      <w:r>
+        <w:t>Üres</w:t>
+      </w:r>
+      <w:proofErr w:type="spellEnd"/>
+      <w:r>
+        <w:t xml:space="preserve"> </w:t>
+      </w:r>
+      <w:proofErr w:type="spellStart"/>
+      <w:r>
+        <w:t>állapot</w:t>
+      </w:r>
+      <w:proofErr w:type="spellEnd"/>
+      <w:r>
+        <w:t xml:space="preserve"> </w:t>
+      </w:r>
+      <w:proofErr w:type="spellStart"/>
+      <w:r>
+        <w:t>megjelenik</w:t>
+      </w:r>
+      <w:proofErr w:type="spellEnd"/>
+      <w:r>
+        <w:t xml:space="preserve"> ha nincs kezelés </w:t>
+      </w:r>
+    </w:p>
+    <w:p>
+      <w:pPr>
+        <w:pStyle w:val="Cmsor3"/>
+      </w:pPr>
+      <w:proofErr w:type="spellStart"/>
+      <w:r>
+        <w:t>UserSidebar</w:t>
+      </w:r>
+      <w:proofErr w:type="spellEnd"/>
+    </w:p>
+    <w:p>
+      <w:pPr>
+        <w:tabs>
+          <w:tab w:val="num" w:pos="720"/>
+        </w:tabs>
+      </w:pPr>
+      <w:r>
+        <w:t xml:space="preserve">- </w:t>
+      </w:r>
+      <w:r>
+        <w:t xml:space="preserve">Loading </w:t>
+      </w:r>
+      <w:proofErr w:type="spellStart"/>
+      <w:r>
+        <w:t>állapot</w:t>
+      </w:r>
+      <w:proofErr w:type="spellEnd"/>
+      <w:r>
+        <w:t xml:space="preserve"> </w:t>
+      </w:r>
+      <w:proofErr w:type="spellStart"/>
+      <w:r>
+        <w:t>megjelenik</w:t>
+      </w:r>
+      <w:proofErr w:type="spellEnd"/>
+      <w:r>
+        <w:t xml:space="preserve"> API hívás előtt </w:t>
+      </w:r>
+    </w:p>
+    <w:p>
+      <w:pPr>
+        <w:tabs>
+          <w:tab w:val="num" w:pos="720"/>
+        </w:tabs>
+      </w:pPr>
+      <w:r>
+        <w:t xml:space="preserve">- </w:t>
+      </w:r>
+      <w:proofErr w:type="spellStart"/>
+      <w:r>
+        <w:t>Felhasználó</w:t>
+      </w:r>
+      <w:proofErr w:type="spellEnd"/>
+      <w:r>
+        <w:t xml:space="preserve"> neve megjelenik betöltés után </w:t>
+      </w:r>
+    </w:p>
+    <w:p>
+      <w:pPr>
+        <w:tabs>
+          <w:tab w:val="num" w:pos="720"/>
+        </w:tabs>
+      </w:pPr>
+      <w:r>
+        <w:t xml:space="preserve">- </w:t>
+      </w:r>
+      <w:proofErr w:type="spellStart"/>
+      <w:r>
+        <w:t>Navigációs</w:t>
+      </w:r>
+      <w:proofErr w:type="spellEnd"/>
+      <w:r>
+        <w:t xml:space="preserve"> </w:t>
+      </w:r>
+      <w:proofErr w:type="spellStart"/>
+      <w:r>
+        <w:t>menüpontok</w:t>
+      </w:r>
+      <w:proofErr w:type="spellEnd"/>
+      <w:r>
+        <w:t xml:space="preserve"> </w:t>
+      </w:r>
+      <w:proofErr w:type="spellStart"/>
+      <w:r>
+        <w:t>megjelennek</w:t>
+      </w:r>
+      <w:proofErr w:type="spellEnd"/>
+      <w:r>
+        <w:t xml:space="preserve"> </w:t>
+      </w:r>
+    </w:p>
+    <w:p>
+      <w:pPr>
+        <w:tabs>
+          <w:tab w:val="num" w:pos="720"/>
+        </w:tabs>
+      </w:pPr>
+      <w:r>
+        <w:t xml:space="preserve">- </w:t>
+      </w:r>
+      <w:r>
+        <w:t xml:space="preserve">Logout </w:t>
+      </w:r>
+      <w:proofErr w:type="spellStart"/>
+      <w:r>
+        <w:t>törli</w:t>
+      </w:r>
+      <w:proofErr w:type="spellEnd"/>
+      <w:r>
+        <w:t xml:space="preserve"> a </w:t>
+      </w:r>
+      <w:proofErr w:type="spellStart"/>
+      <w:r>
+        <w:t>tokent</w:t>
+      </w:r>
+      <w:proofErr w:type="spellEnd"/>
+      <w:r>
+        <w:t xml:space="preserve"> </w:t>
+      </w:r>
+    </w:p>
+    <w:p>
+      <w:pPr>
+        <w:tabs>
+          <w:tab w:val="num" w:pos="720"/>
+        </w:tabs>
+      </w:pPr>
+      <w:r>
+        <w:t xml:space="preserve">- </w:t>
+      </w:r>
+      <w:proofErr w:type="spellStart"/>
+      <w:r>
+        <w:t>Navigáció</w:t>
+      </w:r>
+      <w:proofErr w:type="spellEnd"/>
+      <w:r>
+        <w:t xml:space="preserve"> login </w:t>
+      </w:r>
+      <w:proofErr w:type="spellStart"/>
+      <w:r>
+        <w:t>oldalra</w:t>
+      </w:r>
+      <w:proofErr w:type="spellEnd"/>
+      <w:r>
+        <w:t xml:space="preserve"> logout után </w:t>
+      </w:r>
+    </w:p>
+    <w:p>
+      <w:pPr>
+        <w:tabs>
+          <w:tab w:val="num" w:pos="720"/>
+        </w:tabs>
+      </w:pPr>
+      <w:r>
+        <w:t xml:space="preserve">- </w:t>
+      </w:r>
+      <w:r>
+        <w:t>Mobil hamburger menü működik</w:t>
+      </w:r>
+    </w:p>
+    <w:p/>
+    <w:p>
+      <w:pPr>
+        <w:pStyle w:val="Cmsor2"/>
+        <w:rPr>
+          <w:lang w:val="hu-HU"/>
+        </w:rPr>
+      </w:pPr>
+      <w:r>
+        <w:t xml:space="preserve">5. </w:t>
+      </w:r>
+      <w:proofErr w:type="spellStart"/>
+      <w:r>
+        <w:t>Tesztelési</w:t>
+      </w:r>
+      <w:proofErr w:type="spellEnd"/>
+      <w:r>
+        <w:t xml:space="preserve"> </w:t>
+      </w:r>
+      <w:proofErr w:type="spellStart"/>
+      <w:r>
+        <w:t>eredmények</w:t>
+      </w:r>
+      <w:proofErr w:type="spellEnd"/>
+    </w:p>
+    <w:p>
+      <w:pPr>
+        <w:rPr>
+          <w:lang w:val="hu-HU"/>
+        </w:rPr>
+      </w:pPr>
+      <w:r>
+        <w:rPr>
+          <w:lang w:val="hu-HU"/>
+        </w:rPr>
+        <w:t>Tesztelt területek:</w:t>
+      </w:r>
+    </w:p>
+    <w:p>
+      <w:pPr>
+        <w:numPr>
+          <w:ilvl w:val="0"/>
+          <w:numId w:val="10"/>
+        </w:numPr>
+        <w:rPr>
+          <w:lang w:val="hu-HU"/>
+        </w:rPr>
+      </w:pPr>
+      <w:proofErr w:type="spellStart"/>
+      <w:r>
+        <w:rPr>
+          <w:lang w:val="hu-HU"/>
+        </w:rPr>
+        <w:t>admin</w:t>
+      </w:r>
+      <w:proofErr w:type="spellEnd"/>
+      <w:r>
+        <w:rPr>
+          <w:lang w:val="hu-HU"/>
+        </w:rPr>
+        <w:t xml:space="preserve"> felület működése </w:t>
+      </w:r>
+    </w:p>
+    <w:p>
+      <w:pPr>
+        <w:numPr>
+          <w:ilvl w:val="0"/>
+          <w:numId w:val="10"/>
+        </w:numPr>
+        <w:rPr>
+          <w:lang w:val="hu-HU"/>
+        </w:rPr>
+      </w:pPr>
+      <w:proofErr w:type="spellStart"/>
+      <w:r>
+        <w:rPr>
+          <w:lang w:val="hu-HU"/>
+        </w:rPr>
+        <w:t>user</w:t>
+      </w:r>
+      <w:proofErr w:type="spellEnd"/>
+      <w:r>
+        <w:rPr>
+          <w:lang w:val="hu-HU"/>
+        </w:rPr>
+        <w:t xml:space="preserve"> felület működése </w:t>
+      </w:r>
+    </w:p>
+    <w:p>
+      <w:pPr>
+        <w:numPr>
+          <w:ilvl w:val="0"/>
+          <w:numId w:val="10"/>
+        </w:numPr>
+        <w:rPr>
+          <w:lang w:val="hu-HU"/>
+        </w:rPr>
+      </w:pPr>
+      <w:proofErr w:type="spellStart"/>
+      <w:r>
+        <w:rPr>
+          <w:lang w:val="hu-HU"/>
+        </w:rPr>
+        <w:t>autentikációs</w:t>
+      </w:r>
+      <w:proofErr w:type="spellEnd"/>
+      <w:r>
+        <w:rPr>
+          <w:lang w:val="hu-HU"/>
+        </w:rPr>
+        <w:t xml:space="preserve"> folyamatok </w:t>
+      </w:r>
+    </w:p>
+    <w:p>
+      <w:pPr>
+        <w:numPr>
+          <w:ilvl w:val="0"/>
+          <w:numId w:val="10"/>
+        </w:numPr>
+        <w:rPr>
+          <w:lang w:val="hu-HU"/>
+        </w:rPr>
+      </w:pPr>
+      <w:r>
+        <w:rPr>
+          <w:lang w:val="hu-HU"/>
+        </w:rPr>
+        <w:t xml:space="preserve">CRUD műveletek </w:t>
+      </w:r>
+    </w:p>
+    <w:p>
+      <w:pPr>
+        <w:numPr>
+          <w:ilvl w:val="0"/>
+          <w:numId w:val="10"/>
+        </w:numPr>
+        <w:rPr>
+          <w:lang w:val="hu-HU"/>
+        </w:rPr>
+      </w:pPr>
+      <w:proofErr w:type="spellStart"/>
+      <w:r>
+        <w:rPr>
+          <w:lang w:val="hu-HU"/>
+        </w:rPr>
+        <w:t>modal</w:t>
+      </w:r>
+      <w:proofErr w:type="spellEnd"/>
+      <w:r>
+        <w:rPr>
+          <w:lang w:val="hu-HU"/>
+        </w:rPr>
+        <w:t xml:space="preserve"> komponensek </w:t>
+      </w:r>
+    </w:p>
+    <w:p>
+      <w:pPr>
+        <w:numPr>
+          <w:ilvl w:val="0"/>
+          <w:numId w:val="10"/>
+        </w:numPr>
+        <w:rPr>
+          <w:lang w:val="hu-HU"/>
+        </w:rPr>
+      </w:pPr>
+      <w:r>
+        <w:rPr>
+          <w:lang w:val="hu-HU"/>
+        </w:rPr>
+        <w:t xml:space="preserve">validációk </w:t>
+      </w:r>
+    </w:p>
+    <w:p>
+      <w:pPr>
+        <w:numPr>
+          <w:ilvl w:val="0"/>
+          <w:numId w:val="10"/>
+        </w:numPr>
+        <w:rPr>
+          <w:lang w:val="hu-HU"/>
+        </w:rPr>
+      </w:pPr>
+      <w:r>
+        <w:rPr>
+          <w:lang w:val="hu-HU"/>
+        </w:rPr>
+        <w:t xml:space="preserve">navigáció </w:t>
+      </w:r>
+    </w:p>
+    <w:p>
+      <w:pPr>
+        <w:numPr>
+          <w:ilvl w:val="0"/>
+          <w:numId w:val="10"/>
+        </w:numPr>
+        <w:rPr>
+          <w:lang w:val="hu-HU"/>
+        </w:rPr>
+      </w:pPr>
+      <w:r>
+        <w:rPr>
+          <w:lang w:val="hu-HU"/>
+        </w:rPr>
+        <w:t xml:space="preserve">API kommunikáció </w:t>
+      </w:r>
+    </w:p>
+    <w:p>
+      <w:pPr>
+        <w:numPr>
+          <w:ilvl w:val="0"/>
+          <w:numId w:val="10"/>
+        </w:numPr>
+        <w:rPr>
+          <w:lang w:val="hu-HU"/>
+        </w:rPr>
+      </w:pPr>
+      <w:r>
+        <w:rPr>
+          <w:lang w:val="hu-HU"/>
+        </w:rPr>
+        <w:t xml:space="preserve">hibakezelés </w:t>
+      </w:r>
+    </w:p>
+    <w:p>
+      <w:pPr>
+        <w:numPr>
+          <w:ilvl w:val="0"/>
+          <w:numId w:val="10"/>
+        </w:numPr>
+        <w:rPr>
+          <w:lang w:val="hu-HU"/>
+        </w:rPr>
+      </w:pPr>
+      <w:proofErr w:type="spellStart"/>
+      <w:r>
+        <w:rPr>
+          <w:lang w:val="hu-HU"/>
+        </w:rPr>
+        <w:t>loading</w:t>
+      </w:r>
+      <w:proofErr w:type="spellEnd"/>
+      <w:r>
+        <w:rPr>
+          <w:lang w:val="hu-HU"/>
+        </w:rPr>
+        <w:t xml:space="preserve"> állapotok </w:t>
+      </w:r>
+    </w:p>
+    <w:p>
+      <w:pPr>
+        <w:rPr>
+          <w:lang w:val="hu-HU"/>
+        </w:rPr>
+      </w:pPr>
+      <w:r>
+        <w:rPr>
+          <w:lang w:val="hu-HU"/>
+        </w:rPr>
+        <w:t xml:space="preserve">A </w:t>
+      </w:r>
+      <w:proofErr w:type="spellStart"/>
+      <w:r>
+        <w:rPr>
+          <w:lang w:val="hu-HU"/>
+        </w:rPr>
+        <w:t>mockolt</w:t>
+      </w:r>
+      <w:proofErr w:type="spellEnd"/>
+      <w:r>
+        <w:rPr>
+          <w:lang w:val="hu-HU"/>
+        </w:rPr>
+        <w:t xml:space="preserve"> API hívások segítségével ellenőriztem az aszinkron működést és a hibakezelést is.</w:t>
+      </w:r>
+    </w:p>
+    <w:p>
+      <w:r>
+        <w:lastRenderedPageBreak/>
         <w:drawing>
-          <wp:inline distT="0" distB="0" distL="0" distR="0" wp14:anchorId="611430AA" wp14:editId="5E9BE2B1">
-            <wp:extent cx="2886478" cy="905001"/>
-            <wp:effectExtent l="0" t="0" r="9525" b="9525"/>
-            <wp:docPr id="1229380820" name="Kép 1"/>
+          <wp:inline distT="0" distB="0" distL="0" distR="0" wp14:anchorId="52689929" wp14:editId="11C8A80B">
+            <wp:extent cx="3029373" cy="1086002"/>
+            <wp:effectExtent l="0" t="0" r="0" b="0"/>
+            <wp:docPr id="1536689123" name="Kép 1"/>
             <wp:cNvGraphicFramePr>
               <a:graphicFrameLocks xmlns:a="http://schemas.openxmlformats.org/drawingml/2006/main" noChangeAspect="1"/>
             </wp:cNvGraphicFramePr>
@@ -1286,7 +2577,7 @@
               <a:graphicData uri="http://schemas.openxmlformats.org/drawingml/2006/picture">
                 <pic:pic xmlns:pic="http://schemas.openxmlformats.org/drawingml/2006/picture">
                   <pic:nvPicPr>
-                    <pic:cNvPr id="1229380820" name=""/>
+                    <pic:cNvPr id="1536689123" name=""/>
                     <pic:cNvPicPr/>
                   </pic:nvPicPr>
                   <pic:blipFill>
@@ -1298,7 +2589,7 @@
                   <pic:spPr>
                     <a:xfrm>
                       <a:off x="0" y="0"/>
-                      <a:ext cx="2886478" cy="905001"/>
+                      <a:ext cx="3029373" cy="1086002"/>
                     </a:xfrm>
                     <a:prstGeom prst="rect">
                       <a:avLst/>
@@ -1442,12 +2733,12 @@
       </w:r>
       <w:proofErr w:type="spellStart"/>
       <w:r>
-        <w:t>felismeréséhez.</w:t>
-      </w:r>
-      <w:r>
-        <w:t>f</w:t>
-      </w:r>
-      <w:proofErr w:type="spellEnd"/>
+        <w:t>felismeréséhez</w:t>
+      </w:r>
+      <w:proofErr w:type="spellEnd"/>
+      <w:r>
+        <w:t>.</w:t>
+      </w:r>
     </w:p>
     <w:p>
       <w:pPr>
@@ -1634,6 +2925,1465 @@
       </w:pPr>
       <w:rPr>
         <w:rFonts w:ascii="Symbol" w:hAnsi="Symbol" w:hint="default"/>
+      </w:rPr>
+    </w:lvl>
+  </w:abstractNum>
+  <w:abstractNum w:abstractNumId="9" w15:restartNumberingAfterBreak="0">
+    <w:nsid w:val="004E6658"/>
+    <w:multiLevelType w:val="hybridMultilevel"/>
+    <w:tmpl w:val="E4EE1886"/>
+    <w:lvl w:ilvl="0" w:tplc="EBDA98B6">
+      <w:start w:val="7"/>
+      <w:numFmt w:val="bullet"/>
+      <w:lvlText w:val="-"/>
+      <w:lvlJc w:val="left"/>
+      <w:pPr>
+        <w:ind w:left="720" w:hanging="360"/>
+      </w:pPr>
+      <w:rPr>
+        <w:rFonts w:ascii="Cambria" w:eastAsiaTheme="minorEastAsia" w:hAnsi="Cambria" w:cstheme="minorBidi" w:hint="default"/>
+      </w:rPr>
+    </w:lvl>
+    <w:lvl w:ilvl="1" w:tplc="040E0003" w:tentative="1">
+      <w:start w:val="1"/>
+      <w:numFmt w:val="bullet"/>
+      <w:lvlText w:val="o"/>
+      <w:lvlJc w:val="left"/>
+      <w:pPr>
+        <w:ind w:left="1440" w:hanging="360"/>
+      </w:pPr>
+      <w:rPr>
+        <w:rFonts w:ascii="Courier New" w:hAnsi="Courier New" w:cs="Courier New" w:hint="default"/>
+      </w:rPr>
+    </w:lvl>
+    <w:lvl w:ilvl="2" w:tplc="040E0005" w:tentative="1">
+      <w:start w:val="1"/>
+      <w:numFmt w:val="bullet"/>
+      <w:lvlText w:val=""/>
+      <w:lvlJc w:val="left"/>
+      <w:pPr>
+        <w:ind w:left="2160" w:hanging="360"/>
+      </w:pPr>
+      <w:rPr>
+        <w:rFonts w:ascii="Wingdings" w:hAnsi="Wingdings" w:hint="default"/>
+      </w:rPr>
+    </w:lvl>
+    <w:lvl w:ilvl="3" w:tplc="040E0001" w:tentative="1">
+      <w:start w:val="1"/>
+      <w:numFmt w:val="bullet"/>
+      <w:lvlText w:val=""/>
+      <w:lvlJc w:val="left"/>
+      <w:pPr>
+        <w:ind w:left="2880" w:hanging="360"/>
+      </w:pPr>
+      <w:rPr>
+        <w:rFonts w:ascii="Symbol" w:hAnsi="Symbol" w:hint="default"/>
+      </w:rPr>
+    </w:lvl>
+    <w:lvl w:ilvl="4" w:tplc="040E0003" w:tentative="1">
+      <w:start w:val="1"/>
+      <w:numFmt w:val="bullet"/>
+      <w:lvlText w:val="o"/>
+      <w:lvlJc w:val="left"/>
+      <w:pPr>
+        <w:ind w:left="3600" w:hanging="360"/>
+      </w:pPr>
+      <w:rPr>
+        <w:rFonts w:ascii="Courier New" w:hAnsi="Courier New" w:cs="Courier New" w:hint="default"/>
+      </w:rPr>
+    </w:lvl>
+    <w:lvl w:ilvl="5" w:tplc="040E0005" w:tentative="1">
+      <w:start w:val="1"/>
+      <w:numFmt w:val="bullet"/>
+      <w:lvlText w:val=""/>
+      <w:lvlJc w:val="left"/>
+      <w:pPr>
+        <w:ind w:left="4320" w:hanging="360"/>
+      </w:pPr>
+      <w:rPr>
+        <w:rFonts w:ascii="Wingdings" w:hAnsi="Wingdings" w:hint="default"/>
+      </w:rPr>
+    </w:lvl>
+    <w:lvl w:ilvl="6" w:tplc="040E0001" w:tentative="1">
+      <w:start w:val="1"/>
+      <w:numFmt w:val="bullet"/>
+      <w:lvlText w:val=""/>
+      <w:lvlJc w:val="left"/>
+      <w:pPr>
+        <w:ind w:left="5040" w:hanging="360"/>
+      </w:pPr>
+      <w:rPr>
+        <w:rFonts w:ascii="Symbol" w:hAnsi="Symbol" w:hint="default"/>
+      </w:rPr>
+    </w:lvl>
+    <w:lvl w:ilvl="7" w:tplc="040E0003" w:tentative="1">
+      <w:start w:val="1"/>
+      <w:numFmt w:val="bullet"/>
+      <w:lvlText w:val="o"/>
+      <w:lvlJc w:val="left"/>
+      <w:pPr>
+        <w:ind w:left="5760" w:hanging="360"/>
+      </w:pPr>
+      <w:rPr>
+        <w:rFonts w:ascii="Courier New" w:hAnsi="Courier New" w:cs="Courier New" w:hint="default"/>
+      </w:rPr>
+    </w:lvl>
+    <w:lvl w:ilvl="8" w:tplc="040E0005" w:tentative="1">
+      <w:start w:val="1"/>
+      <w:numFmt w:val="bullet"/>
+      <w:lvlText w:val=""/>
+      <w:lvlJc w:val="left"/>
+      <w:pPr>
+        <w:ind w:left="6480" w:hanging="360"/>
+      </w:pPr>
+      <w:rPr>
+        <w:rFonts w:ascii="Wingdings" w:hAnsi="Wingdings" w:hint="default"/>
+      </w:rPr>
+    </w:lvl>
+  </w:abstractNum>
+  <w:abstractNum w:abstractNumId="10" w15:restartNumberingAfterBreak="0">
+    <w:nsid w:val="10C462C2"/>
+    <w:multiLevelType w:val="hybridMultilevel"/>
+    <w:tmpl w:val="F30CAB0A"/>
+    <w:lvl w:ilvl="0" w:tplc="C200F356">
+      <w:start w:val="7"/>
+      <w:numFmt w:val="bullet"/>
+      <w:lvlText w:val="-"/>
+      <w:lvlJc w:val="left"/>
+      <w:pPr>
+        <w:ind w:left="720" w:hanging="360"/>
+      </w:pPr>
+      <w:rPr>
+        <w:rFonts w:ascii="Cambria" w:eastAsiaTheme="minorEastAsia" w:hAnsi="Cambria" w:cstheme="minorBidi" w:hint="default"/>
+      </w:rPr>
+    </w:lvl>
+    <w:lvl w:ilvl="1" w:tplc="040E0003" w:tentative="1">
+      <w:start w:val="1"/>
+      <w:numFmt w:val="bullet"/>
+      <w:lvlText w:val="o"/>
+      <w:lvlJc w:val="left"/>
+      <w:pPr>
+        <w:ind w:left="1440" w:hanging="360"/>
+      </w:pPr>
+      <w:rPr>
+        <w:rFonts w:ascii="Courier New" w:hAnsi="Courier New" w:cs="Courier New" w:hint="default"/>
+      </w:rPr>
+    </w:lvl>
+    <w:lvl w:ilvl="2" w:tplc="040E0005" w:tentative="1">
+      <w:start w:val="1"/>
+      <w:numFmt w:val="bullet"/>
+      <w:lvlText w:val=""/>
+      <w:lvlJc w:val="left"/>
+      <w:pPr>
+        <w:ind w:left="2160" w:hanging="360"/>
+      </w:pPr>
+      <w:rPr>
+        <w:rFonts w:ascii="Wingdings" w:hAnsi="Wingdings" w:hint="default"/>
+      </w:rPr>
+    </w:lvl>
+    <w:lvl w:ilvl="3" w:tplc="040E0001" w:tentative="1">
+      <w:start w:val="1"/>
+      <w:numFmt w:val="bullet"/>
+      <w:lvlText w:val=""/>
+      <w:lvlJc w:val="left"/>
+      <w:pPr>
+        <w:ind w:left="2880" w:hanging="360"/>
+      </w:pPr>
+      <w:rPr>
+        <w:rFonts w:ascii="Symbol" w:hAnsi="Symbol" w:hint="default"/>
+      </w:rPr>
+    </w:lvl>
+    <w:lvl w:ilvl="4" w:tplc="040E0003" w:tentative="1">
+      <w:start w:val="1"/>
+      <w:numFmt w:val="bullet"/>
+      <w:lvlText w:val="o"/>
+      <w:lvlJc w:val="left"/>
+      <w:pPr>
+        <w:ind w:left="3600" w:hanging="360"/>
+      </w:pPr>
+      <w:rPr>
+        <w:rFonts w:ascii="Courier New" w:hAnsi="Courier New" w:cs="Courier New" w:hint="default"/>
+      </w:rPr>
+    </w:lvl>
+    <w:lvl w:ilvl="5" w:tplc="040E0005" w:tentative="1">
+      <w:start w:val="1"/>
+      <w:numFmt w:val="bullet"/>
+      <w:lvlText w:val=""/>
+      <w:lvlJc w:val="left"/>
+      <w:pPr>
+        <w:ind w:left="4320" w:hanging="360"/>
+      </w:pPr>
+      <w:rPr>
+        <w:rFonts w:ascii="Wingdings" w:hAnsi="Wingdings" w:hint="default"/>
+      </w:rPr>
+    </w:lvl>
+    <w:lvl w:ilvl="6" w:tplc="040E0001" w:tentative="1">
+      <w:start w:val="1"/>
+      <w:numFmt w:val="bullet"/>
+      <w:lvlText w:val=""/>
+      <w:lvlJc w:val="left"/>
+      <w:pPr>
+        <w:ind w:left="5040" w:hanging="360"/>
+      </w:pPr>
+      <w:rPr>
+        <w:rFonts w:ascii="Symbol" w:hAnsi="Symbol" w:hint="default"/>
+      </w:rPr>
+    </w:lvl>
+    <w:lvl w:ilvl="7" w:tplc="040E0003" w:tentative="1">
+      <w:start w:val="1"/>
+      <w:numFmt w:val="bullet"/>
+      <w:lvlText w:val="o"/>
+      <w:lvlJc w:val="left"/>
+      <w:pPr>
+        <w:ind w:left="5760" w:hanging="360"/>
+      </w:pPr>
+      <w:rPr>
+        <w:rFonts w:ascii="Courier New" w:hAnsi="Courier New" w:cs="Courier New" w:hint="default"/>
+      </w:rPr>
+    </w:lvl>
+    <w:lvl w:ilvl="8" w:tplc="040E0005" w:tentative="1">
+      <w:start w:val="1"/>
+      <w:numFmt w:val="bullet"/>
+      <w:lvlText w:val=""/>
+      <w:lvlJc w:val="left"/>
+      <w:pPr>
+        <w:ind w:left="6480" w:hanging="360"/>
+      </w:pPr>
+      <w:rPr>
+        <w:rFonts w:ascii="Wingdings" w:hAnsi="Wingdings" w:hint="default"/>
+      </w:rPr>
+    </w:lvl>
+  </w:abstractNum>
+  <w:abstractNum w:abstractNumId="11" w15:restartNumberingAfterBreak="0">
+    <w:nsid w:val="1A667A14"/>
+    <w:multiLevelType w:val="hybridMultilevel"/>
+    <w:tmpl w:val="83B427E8"/>
+    <w:lvl w:ilvl="0" w:tplc="9566D3F2">
+      <w:start w:val="7"/>
+      <w:numFmt w:val="bullet"/>
+      <w:lvlText w:val="-"/>
+      <w:lvlJc w:val="left"/>
+      <w:pPr>
+        <w:ind w:left="720" w:hanging="360"/>
+      </w:pPr>
+      <w:rPr>
+        <w:rFonts w:ascii="Cambria" w:eastAsiaTheme="minorEastAsia" w:hAnsi="Cambria" w:cstheme="minorBidi" w:hint="default"/>
+      </w:rPr>
+    </w:lvl>
+    <w:lvl w:ilvl="1" w:tplc="040E0003" w:tentative="1">
+      <w:start w:val="1"/>
+      <w:numFmt w:val="bullet"/>
+      <w:lvlText w:val="o"/>
+      <w:lvlJc w:val="left"/>
+      <w:pPr>
+        <w:ind w:left="1440" w:hanging="360"/>
+      </w:pPr>
+      <w:rPr>
+        <w:rFonts w:ascii="Courier New" w:hAnsi="Courier New" w:cs="Courier New" w:hint="default"/>
+      </w:rPr>
+    </w:lvl>
+    <w:lvl w:ilvl="2" w:tplc="040E0005" w:tentative="1">
+      <w:start w:val="1"/>
+      <w:numFmt w:val="bullet"/>
+      <w:lvlText w:val=""/>
+      <w:lvlJc w:val="left"/>
+      <w:pPr>
+        <w:ind w:left="2160" w:hanging="360"/>
+      </w:pPr>
+      <w:rPr>
+        <w:rFonts w:ascii="Wingdings" w:hAnsi="Wingdings" w:hint="default"/>
+      </w:rPr>
+    </w:lvl>
+    <w:lvl w:ilvl="3" w:tplc="040E0001" w:tentative="1">
+      <w:start w:val="1"/>
+      <w:numFmt w:val="bullet"/>
+      <w:lvlText w:val=""/>
+      <w:lvlJc w:val="left"/>
+      <w:pPr>
+        <w:ind w:left="2880" w:hanging="360"/>
+      </w:pPr>
+      <w:rPr>
+        <w:rFonts w:ascii="Symbol" w:hAnsi="Symbol" w:hint="default"/>
+      </w:rPr>
+    </w:lvl>
+    <w:lvl w:ilvl="4" w:tplc="040E0003" w:tentative="1">
+      <w:start w:val="1"/>
+      <w:numFmt w:val="bullet"/>
+      <w:lvlText w:val="o"/>
+      <w:lvlJc w:val="left"/>
+      <w:pPr>
+        <w:ind w:left="3600" w:hanging="360"/>
+      </w:pPr>
+      <w:rPr>
+        <w:rFonts w:ascii="Courier New" w:hAnsi="Courier New" w:cs="Courier New" w:hint="default"/>
+      </w:rPr>
+    </w:lvl>
+    <w:lvl w:ilvl="5" w:tplc="040E0005" w:tentative="1">
+      <w:start w:val="1"/>
+      <w:numFmt w:val="bullet"/>
+      <w:lvlText w:val=""/>
+      <w:lvlJc w:val="left"/>
+      <w:pPr>
+        <w:ind w:left="4320" w:hanging="360"/>
+      </w:pPr>
+      <w:rPr>
+        <w:rFonts w:ascii="Wingdings" w:hAnsi="Wingdings" w:hint="default"/>
+      </w:rPr>
+    </w:lvl>
+    <w:lvl w:ilvl="6" w:tplc="040E0001" w:tentative="1">
+      <w:start w:val="1"/>
+      <w:numFmt w:val="bullet"/>
+      <w:lvlText w:val=""/>
+      <w:lvlJc w:val="left"/>
+      <w:pPr>
+        <w:ind w:left="5040" w:hanging="360"/>
+      </w:pPr>
+      <w:rPr>
+        <w:rFonts w:ascii="Symbol" w:hAnsi="Symbol" w:hint="default"/>
+      </w:rPr>
+    </w:lvl>
+    <w:lvl w:ilvl="7" w:tplc="040E0003" w:tentative="1">
+      <w:start w:val="1"/>
+      <w:numFmt w:val="bullet"/>
+      <w:lvlText w:val="o"/>
+      <w:lvlJc w:val="left"/>
+      <w:pPr>
+        <w:ind w:left="5760" w:hanging="360"/>
+      </w:pPr>
+      <w:rPr>
+        <w:rFonts w:ascii="Courier New" w:hAnsi="Courier New" w:cs="Courier New" w:hint="default"/>
+      </w:rPr>
+    </w:lvl>
+    <w:lvl w:ilvl="8" w:tplc="040E0005" w:tentative="1">
+      <w:start w:val="1"/>
+      <w:numFmt w:val="bullet"/>
+      <w:lvlText w:val=""/>
+      <w:lvlJc w:val="left"/>
+      <w:pPr>
+        <w:ind w:left="6480" w:hanging="360"/>
+      </w:pPr>
+      <w:rPr>
+        <w:rFonts w:ascii="Wingdings" w:hAnsi="Wingdings" w:hint="default"/>
+      </w:rPr>
+    </w:lvl>
+  </w:abstractNum>
+  <w:abstractNum w:abstractNumId="12" w15:restartNumberingAfterBreak="0">
+    <w:nsid w:val="26F8295A"/>
+    <w:multiLevelType w:val="multilevel"/>
+    <w:tmpl w:val="2F1C97E8"/>
+    <w:lvl w:ilvl="0">
+      <w:start w:val="1"/>
+      <w:numFmt w:val="bullet"/>
+      <w:lvlText w:val=""/>
+      <w:lvlJc w:val="left"/>
+      <w:pPr>
+        <w:tabs>
+          <w:tab w:val="num" w:pos="720"/>
+        </w:tabs>
+        <w:ind w:left="720" w:hanging="360"/>
+      </w:pPr>
+      <w:rPr>
+        <w:rFonts w:ascii="Symbol" w:hAnsi="Symbol" w:hint="default"/>
+        <w:sz w:val="20"/>
+      </w:rPr>
+    </w:lvl>
+    <w:lvl w:ilvl="1" w:tentative="1">
+      <w:start w:val="1"/>
+      <w:numFmt w:val="bullet"/>
+      <w:lvlText w:val="o"/>
+      <w:lvlJc w:val="left"/>
+      <w:pPr>
+        <w:tabs>
+          <w:tab w:val="num" w:pos="1440"/>
+        </w:tabs>
+        <w:ind w:left="1440" w:hanging="360"/>
+      </w:pPr>
+      <w:rPr>
+        <w:rFonts w:ascii="Courier New" w:hAnsi="Courier New" w:hint="default"/>
+        <w:sz w:val="20"/>
+      </w:rPr>
+    </w:lvl>
+    <w:lvl w:ilvl="2" w:tentative="1">
+      <w:start w:val="1"/>
+      <w:numFmt w:val="bullet"/>
+      <w:lvlText w:val=""/>
+      <w:lvlJc w:val="left"/>
+      <w:pPr>
+        <w:tabs>
+          <w:tab w:val="num" w:pos="2160"/>
+        </w:tabs>
+        <w:ind w:left="2160" w:hanging="360"/>
+      </w:pPr>
+      <w:rPr>
+        <w:rFonts w:ascii="Wingdings" w:hAnsi="Wingdings" w:hint="default"/>
+        <w:sz w:val="20"/>
+      </w:rPr>
+    </w:lvl>
+    <w:lvl w:ilvl="3" w:tentative="1">
+      <w:start w:val="1"/>
+      <w:numFmt w:val="bullet"/>
+      <w:lvlText w:val=""/>
+      <w:lvlJc w:val="left"/>
+      <w:pPr>
+        <w:tabs>
+          <w:tab w:val="num" w:pos="2880"/>
+        </w:tabs>
+        <w:ind w:left="2880" w:hanging="360"/>
+      </w:pPr>
+      <w:rPr>
+        <w:rFonts w:ascii="Wingdings" w:hAnsi="Wingdings" w:hint="default"/>
+        <w:sz w:val="20"/>
+      </w:rPr>
+    </w:lvl>
+    <w:lvl w:ilvl="4" w:tentative="1">
+      <w:start w:val="1"/>
+      <w:numFmt w:val="bullet"/>
+      <w:lvlText w:val=""/>
+      <w:lvlJc w:val="left"/>
+      <w:pPr>
+        <w:tabs>
+          <w:tab w:val="num" w:pos="3600"/>
+        </w:tabs>
+        <w:ind w:left="3600" w:hanging="360"/>
+      </w:pPr>
+      <w:rPr>
+        <w:rFonts w:ascii="Wingdings" w:hAnsi="Wingdings" w:hint="default"/>
+        <w:sz w:val="20"/>
+      </w:rPr>
+    </w:lvl>
+    <w:lvl w:ilvl="5" w:tentative="1">
+      <w:start w:val="1"/>
+      <w:numFmt w:val="bullet"/>
+      <w:lvlText w:val=""/>
+      <w:lvlJc w:val="left"/>
+      <w:pPr>
+        <w:tabs>
+          <w:tab w:val="num" w:pos="4320"/>
+        </w:tabs>
+        <w:ind w:left="4320" w:hanging="360"/>
+      </w:pPr>
+      <w:rPr>
+        <w:rFonts w:ascii="Wingdings" w:hAnsi="Wingdings" w:hint="default"/>
+        <w:sz w:val="20"/>
+      </w:rPr>
+    </w:lvl>
+    <w:lvl w:ilvl="6" w:tentative="1">
+      <w:start w:val="1"/>
+      <w:numFmt w:val="bullet"/>
+      <w:lvlText w:val=""/>
+      <w:lvlJc w:val="left"/>
+      <w:pPr>
+        <w:tabs>
+          <w:tab w:val="num" w:pos="5040"/>
+        </w:tabs>
+        <w:ind w:left="5040" w:hanging="360"/>
+      </w:pPr>
+      <w:rPr>
+        <w:rFonts w:ascii="Wingdings" w:hAnsi="Wingdings" w:hint="default"/>
+        <w:sz w:val="20"/>
+      </w:rPr>
+    </w:lvl>
+    <w:lvl w:ilvl="7" w:tentative="1">
+      <w:start w:val="1"/>
+      <w:numFmt w:val="bullet"/>
+      <w:lvlText w:val=""/>
+      <w:lvlJc w:val="left"/>
+      <w:pPr>
+        <w:tabs>
+          <w:tab w:val="num" w:pos="5760"/>
+        </w:tabs>
+        <w:ind w:left="5760" w:hanging="360"/>
+      </w:pPr>
+      <w:rPr>
+        <w:rFonts w:ascii="Wingdings" w:hAnsi="Wingdings" w:hint="default"/>
+        <w:sz w:val="20"/>
+      </w:rPr>
+    </w:lvl>
+    <w:lvl w:ilvl="8" w:tentative="1">
+      <w:start w:val="1"/>
+      <w:numFmt w:val="bullet"/>
+      <w:lvlText w:val=""/>
+      <w:lvlJc w:val="left"/>
+      <w:pPr>
+        <w:tabs>
+          <w:tab w:val="num" w:pos="6480"/>
+        </w:tabs>
+        <w:ind w:left="6480" w:hanging="360"/>
+      </w:pPr>
+      <w:rPr>
+        <w:rFonts w:ascii="Wingdings" w:hAnsi="Wingdings" w:hint="default"/>
+        <w:sz w:val="20"/>
+      </w:rPr>
+    </w:lvl>
+  </w:abstractNum>
+  <w:abstractNum w:abstractNumId="13" w15:restartNumberingAfterBreak="0">
+    <w:nsid w:val="294573EA"/>
+    <w:multiLevelType w:val="multilevel"/>
+    <w:tmpl w:val="552E44D6"/>
+    <w:lvl w:ilvl="0">
+      <w:start w:val="1"/>
+      <w:numFmt w:val="bullet"/>
+      <w:lvlText w:val=""/>
+      <w:lvlJc w:val="left"/>
+      <w:pPr>
+        <w:tabs>
+          <w:tab w:val="num" w:pos="720"/>
+        </w:tabs>
+        <w:ind w:left="720" w:hanging="360"/>
+      </w:pPr>
+      <w:rPr>
+        <w:rFonts w:ascii="Symbol" w:hAnsi="Symbol" w:hint="default"/>
+        <w:sz w:val="20"/>
+      </w:rPr>
+    </w:lvl>
+    <w:lvl w:ilvl="1" w:tentative="1">
+      <w:start w:val="1"/>
+      <w:numFmt w:val="bullet"/>
+      <w:lvlText w:val="o"/>
+      <w:lvlJc w:val="left"/>
+      <w:pPr>
+        <w:tabs>
+          <w:tab w:val="num" w:pos="1440"/>
+        </w:tabs>
+        <w:ind w:left="1440" w:hanging="360"/>
+      </w:pPr>
+      <w:rPr>
+        <w:rFonts w:ascii="Courier New" w:hAnsi="Courier New" w:hint="default"/>
+        <w:sz w:val="20"/>
+      </w:rPr>
+    </w:lvl>
+    <w:lvl w:ilvl="2" w:tentative="1">
+      <w:start w:val="1"/>
+      <w:numFmt w:val="bullet"/>
+      <w:lvlText w:val=""/>
+      <w:lvlJc w:val="left"/>
+      <w:pPr>
+        <w:tabs>
+          <w:tab w:val="num" w:pos="2160"/>
+        </w:tabs>
+        <w:ind w:left="2160" w:hanging="360"/>
+      </w:pPr>
+      <w:rPr>
+        <w:rFonts w:ascii="Wingdings" w:hAnsi="Wingdings" w:hint="default"/>
+        <w:sz w:val="20"/>
+      </w:rPr>
+    </w:lvl>
+    <w:lvl w:ilvl="3" w:tentative="1">
+      <w:start w:val="1"/>
+      <w:numFmt w:val="bullet"/>
+      <w:lvlText w:val=""/>
+      <w:lvlJc w:val="left"/>
+      <w:pPr>
+        <w:tabs>
+          <w:tab w:val="num" w:pos="2880"/>
+        </w:tabs>
+        <w:ind w:left="2880" w:hanging="360"/>
+      </w:pPr>
+      <w:rPr>
+        <w:rFonts w:ascii="Wingdings" w:hAnsi="Wingdings" w:hint="default"/>
+        <w:sz w:val="20"/>
+      </w:rPr>
+    </w:lvl>
+    <w:lvl w:ilvl="4" w:tentative="1">
+      <w:start w:val="1"/>
+      <w:numFmt w:val="bullet"/>
+      <w:lvlText w:val=""/>
+      <w:lvlJc w:val="left"/>
+      <w:pPr>
+        <w:tabs>
+          <w:tab w:val="num" w:pos="3600"/>
+        </w:tabs>
+        <w:ind w:left="3600" w:hanging="360"/>
+      </w:pPr>
+      <w:rPr>
+        <w:rFonts w:ascii="Wingdings" w:hAnsi="Wingdings" w:hint="default"/>
+        <w:sz w:val="20"/>
+      </w:rPr>
+    </w:lvl>
+    <w:lvl w:ilvl="5" w:tentative="1">
+      <w:start w:val="1"/>
+      <w:numFmt w:val="bullet"/>
+      <w:lvlText w:val=""/>
+      <w:lvlJc w:val="left"/>
+      <w:pPr>
+        <w:tabs>
+          <w:tab w:val="num" w:pos="4320"/>
+        </w:tabs>
+        <w:ind w:left="4320" w:hanging="360"/>
+      </w:pPr>
+      <w:rPr>
+        <w:rFonts w:ascii="Wingdings" w:hAnsi="Wingdings" w:hint="default"/>
+        <w:sz w:val="20"/>
+      </w:rPr>
+    </w:lvl>
+    <w:lvl w:ilvl="6" w:tentative="1">
+      <w:start w:val="1"/>
+      <w:numFmt w:val="bullet"/>
+      <w:lvlText w:val=""/>
+      <w:lvlJc w:val="left"/>
+      <w:pPr>
+        <w:tabs>
+          <w:tab w:val="num" w:pos="5040"/>
+        </w:tabs>
+        <w:ind w:left="5040" w:hanging="360"/>
+      </w:pPr>
+      <w:rPr>
+        <w:rFonts w:ascii="Wingdings" w:hAnsi="Wingdings" w:hint="default"/>
+        <w:sz w:val="20"/>
+      </w:rPr>
+    </w:lvl>
+    <w:lvl w:ilvl="7" w:tentative="1">
+      <w:start w:val="1"/>
+      <w:numFmt w:val="bullet"/>
+      <w:lvlText w:val=""/>
+      <w:lvlJc w:val="left"/>
+      <w:pPr>
+        <w:tabs>
+          <w:tab w:val="num" w:pos="5760"/>
+        </w:tabs>
+        <w:ind w:left="5760" w:hanging="360"/>
+      </w:pPr>
+      <w:rPr>
+        <w:rFonts w:ascii="Wingdings" w:hAnsi="Wingdings" w:hint="default"/>
+        <w:sz w:val="20"/>
+      </w:rPr>
+    </w:lvl>
+    <w:lvl w:ilvl="8" w:tentative="1">
+      <w:start w:val="1"/>
+      <w:numFmt w:val="bullet"/>
+      <w:lvlText w:val=""/>
+      <w:lvlJc w:val="left"/>
+      <w:pPr>
+        <w:tabs>
+          <w:tab w:val="num" w:pos="6480"/>
+        </w:tabs>
+        <w:ind w:left="6480" w:hanging="360"/>
+      </w:pPr>
+      <w:rPr>
+        <w:rFonts w:ascii="Wingdings" w:hAnsi="Wingdings" w:hint="default"/>
+        <w:sz w:val="20"/>
+      </w:rPr>
+    </w:lvl>
+  </w:abstractNum>
+  <w:abstractNum w:abstractNumId="14" w15:restartNumberingAfterBreak="0">
+    <w:nsid w:val="3B1E3C13"/>
+    <w:multiLevelType w:val="hybridMultilevel"/>
+    <w:tmpl w:val="1DC21F7A"/>
+    <w:lvl w:ilvl="0" w:tplc="25547482">
+      <w:start w:val="7"/>
+      <w:numFmt w:val="bullet"/>
+      <w:lvlText w:val="-"/>
+      <w:lvlJc w:val="left"/>
+      <w:pPr>
+        <w:ind w:left="720" w:hanging="360"/>
+      </w:pPr>
+      <w:rPr>
+        <w:rFonts w:ascii="Cambria" w:eastAsiaTheme="minorEastAsia" w:hAnsi="Cambria" w:cstheme="minorBidi" w:hint="default"/>
+      </w:rPr>
+    </w:lvl>
+    <w:lvl w:ilvl="1" w:tplc="040E0003" w:tentative="1">
+      <w:start w:val="1"/>
+      <w:numFmt w:val="bullet"/>
+      <w:lvlText w:val="o"/>
+      <w:lvlJc w:val="left"/>
+      <w:pPr>
+        <w:ind w:left="1440" w:hanging="360"/>
+      </w:pPr>
+      <w:rPr>
+        <w:rFonts w:ascii="Courier New" w:hAnsi="Courier New" w:cs="Courier New" w:hint="default"/>
+      </w:rPr>
+    </w:lvl>
+    <w:lvl w:ilvl="2" w:tplc="040E0005" w:tentative="1">
+      <w:start w:val="1"/>
+      <w:numFmt w:val="bullet"/>
+      <w:lvlText w:val=""/>
+      <w:lvlJc w:val="left"/>
+      <w:pPr>
+        <w:ind w:left="2160" w:hanging="360"/>
+      </w:pPr>
+      <w:rPr>
+        <w:rFonts w:ascii="Wingdings" w:hAnsi="Wingdings" w:hint="default"/>
+      </w:rPr>
+    </w:lvl>
+    <w:lvl w:ilvl="3" w:tplc="040E0001" w:tentative="1">
+      <w:start w:val="1"/>
+      <w:numFmt w:val="bullet"/>
+      <w:lvlText w:val=""/>
+      <w:lvlJc w:val="left"/>
+      <w:pPr>
+        <w:ind w:left="2880" w:hanging="360"/>
+      </w:pPr>
+      <w:rPr>
+        <w:rFonts w:ascii="Symbol" w:hAnsi="Symbol" w:hint="default"/>
+      </w:rPr>
+    </w:lvl>
+    <w:lvl w:ilvl="4" w:tplc="040E0003" w:tentative="1">
+      <w:start w:val="1"/>
+      <w:numFmt w:val="bullet"/>
+      <w:lvlText w:val="o"/>
+      <w:lvlJc w:val="left"/>
+      <w:pPr>
+        <w:ind w:left="3600" w:hanging="360"/>
+      </w:pPr>
+      <w:rPr>
+        <w:rFonts w:ascii="Courier New" w:hAnsi="Courier New" w:cs="Courier New" w:hint="default"/>
+      </w:rPr>
+    </w:lvl>
+    <w:lvl w:ilvl="5" w:tplc="040E0005" w:tentative="1">
+      <w:start w:val="1"/>
+      <w:numFmt w:val="bullet"/>
+      <w:lvlText w:val=""/>
+      <w:lvlJc w:val="left"/>
+      <w:pPr>
+        <w:ind w:left="4320" w:hanging="360"/>
+      </w:pPr>
+      <w:rPr>
+        <w:rFonts w:ascii="Wingdings" w:hAnsi="Wingdings" w:hint="default"/>
+      </w:rPr>
+    </w:lvl>
+    <w:lvl w:ilvl="6" w:tplc="040E0001" w:tentative="1">
+      <w:start w:val="1"/>
+      <w:numFmt w:val="bullet"/>
+      <w:lvlText w:val=""/>
+      <w:lvlJc w:val="left"/>
+      <w:pPr>
+        <w:ind w:left="5040" w:hanging="360"/>
+      </w:pPr>
+      <w:rPr>
+        <w:rFonts w:ascii="Symbol" w:hAnsi="Symbol" w:hint="default"/>
+      </w:rPr>
+    </w:lvl>
+    <w:lvl w:ilvl="7" w:tplc="040E0003" w:tentative="1">
+      <w:start w:val="1"/>
+      <w:numFmt w:val="bullet"/>
+      <w:lvlText w:val="o"/>
+      <w:lvlJc w:val="left"/>
+      <w:pPr>
+        <w:ind w:left="5760" w:hanging="360"/>
+      </w:pPr>
+      <w:rPr>
+        <w:rFonts w:ascii="Courier New" w:hAnsi="Courier New" w:cs="Courier New" w:hint="default"/>
+      </w:rPr>
+    </w:lvl>
+    <w:lvl w:ilvl="8" w:tplc="040E0005" w:tentative="1">
+      <w:start w:val="1"/>
+      <w:numFmt w:val="bullet"/>
+      <w:lvlText w:val=""/>
+      <w:lvlJc w:val="left"/>
+      <w:pPr>
+        <w:ind w:left="6480" w:hanging="360"/>
+      </w:pPr>
+      <w:rPr>
+        <w:rFonts w:ascii="Wingdings" w:hAnsi="Wingdings" w:hint="default"/>
+      </w:rPr>
+    </w:lvl>
+  </w:abstractNum>
+  <w:abstractNum w:abstractNumId="15" w15:restartNumberingAfterBreak="0">
+    <w:nsid w:val="42156840"/>
+    <w:multiLevelType w:val="hybridMultilevel"/>
+    <w:tmpl w:val="267CC7AC"/>
+    <w:lvl w:ilvl="0" w:tplc="4A16C556">
+      <w:start w:val="7"/>
+      <w:numFmt w:val="bullet"/>
+      <w:lvlText w:val="-"/>
+      <w:lvlJc w:val="left"/>
+      <w:pPr>
+        <w:ind w:left="720" w:hanging="360"/>
+      </w:pPr>
+      <w:rPr>
+        <w:rFonts w:ascii="Cambria" w:eastAsiaTheme="minorEastAsia" w:hAnsi="Cambria" w:cstheme="minorBidi" w:hint="default"/>
+      </w:rPr>
+    </w:lvl>
+    <w:lvl w:ilvl="1" w:tplc="040E0003" w:tentative="1">
+      <w:start w:val="1"/>
+      <w:numFmt w:val="bullet"/>
+      <w:lvlText w:val="o"/>
+      <w:lvlJc w:val="left"/>
+      <w:pPr>
+        <w:ind w:left="1440" w:hanging="360"/>
+      </w:pPr>
+      <w:rPr>
+        <w:rFonts w:ascii="Courier New" w:hAnsi="Courier New" w:cs="Courier New" w:hint="default"/>
+      </w:rPr>
+    </w:lvl>
+    <w:lvl w:ilvl="2" w:tplc="040E0005" w:tentative="1">
+      <w:start w:val="1"/>
+      <w:numFmt w:val="bullet"/>
+      <w:lvlText w:val=""/>
+      <w:lvlJc w:val="left"/>
+      <w:pPr>
+        <w:ind w:left="2160" w:hanging="360"/>
+      </w:pPr>
+      <w:rPr>
+        <w:rFonts w:ascii="Wingdings" w:hAnsi="Wingdings" w:hint="default"/>
+      </w:rPr>
+    </w:lvl>
+    <w:lvl w:ilvl="3" w:tplc="040E0001" w:tentative="1">
+      <w:start w:val="1"/>
+      <w:numFmt w:val="bullet"/>
+      <w:lvlText w:val=""/>
+      <w:lvlJc w:val="left"/>
+      <w:pPr>
+        <w:ind w:left="2880" w:hanging="360"/>
+      </w:pPr>
+      <w:rPr>
+        <w:rFonts w:ascii="Symbol" w:hAnsi="Symbol" w:hint="default"/>
+      </w:rPr>
+    </w:lvl>
+    <w:lvl w:ilvl="4" w:tplc="040E0003" w:tentative="1">
+      <w:start w:val="1"/>
+      <w:numFmt w:val="bullet"/>
+      <w:lvlText w:val="o"/>
+      <w:lvlJc w:val="left"/>
+      <w:pPr>
+        <w:ind w:left="3600" w:hanging="360"/>
+      </w:pPr>
+      <w:rPr>
+        <w:rFonts w:ascii="Courier New" w:hAnsi="Courier New" w:cs="Courier New" w:hint="default"/>
+      </w:rPr>
+    </w:lvl>
+    <w:lvl w:ilvl="5" w:tplc="040E0005" w:tentative="1">
+      <w:start w:val="1"/>
+      <w:numFmt w:val="bullet"/>
+      <w:lvlText w:val=""/>
+      <w:lvlJc w:val="left"/>
+      <w:pPr>
+        <w:ind w:left="4320" w:hanging="360"/>
+      </w:pPr>
+      <w:rPr>
+        <w:rFonts w:ascii="Wingdings" w:hAnsi="Wingdings" w:hint="default"/>
+      </w:rPr>
+    </w:lvl>
+    <w:lvl w:ilvl="6" w:tplc="040E0001" w:tentative="1">
+      <w:start w:val="1"/>
+      <w:numFmt w:val="bullet"/>
+      <w:lvlText w:val=""/>
+      <w:lvlJc w:val="left"/>
+      <w:pPr>
+        <w:ind w:left="5040" w:hanging="360"/>
+      </w:pPr>
+      <w:rPr>
+        <w:rFonts w:ascii="Symbol" w:hAnsi="Symbol" w:hint="default"/>
+      </w:rPr>
+    </w:lvl>
+    <w:lvl w:ilvl="7" w:tplc="040E0003" w:tentative="1">
+      <w:start w:val="1"/>
+      <w:numFmt w:val="bullet"/>
+      <w:lvlText w:val="o"/>
+      <w:lvlJc w:val="left"/>
+      <w:pPr>
+        <w:ind w:left="5760" w:hanging="360"/>
+      </w:pPr>
+      <w:rPr>
+        <w:rFonts w:ascii="Courier New" w:hAnsi="Courier New" w:cs="Courier New" w:hint="default"/>
+      </w:rPr>
+    </w:lvl>
+    <w:lvl w:ilvl="8" w:tplc="040E0005" w:tentative="1">
+      <w:start w:val="1"/>
+      <w:numFmt w:val="bullet"/>
+      <w:lvlText w:val=""/>
+      <w:lvlJc w:val="left"/>
+      <w:pPr>
+        <w:ind w:left="6480" w:hanging="360"/>
+      </w:pPr>
+      <w:rPr>
+        <w:rFonts w:ascii="Wingdings" w:hAnsi="Wingdings" w:hint="default"/>
+      </w:rPr>
+    </w:lvl>
+  </w:abstractNum>
+  <w:abstractNum w:abstractNumId="16" w15:restartNumberingAfterBreak="0">
+    <w:nsid w:val="4EAD132D"/>
+    <w:multiLevelType w:val="multilevel"/>
+    <w:tmpl w:val="C1627A5C"/>
+    <w:lvl w:ilvl="0">
+      <w:start w:val="1"/>
+      <w:numFmt w:val="bullet"/>
+      <w:lvlText w:val=""/>
+      <w:lvlJc w:val="left"/>
+      <w:pPr>
+        <w:tabs>
+          <w:tab w:val="num" w:pos="720"/>
+        </w:tabs>
+        <w:ind w:left="720" w:hanging="360"/>
+      </w:pPr>
+      <w:rPr>
+        <w:rFonts w:ascii="Symbol" w:hAnsi="Symbol" w:hint="default"/>
+        <w:sz w:val="20"/>
+      </w:rPr>
+    </w:lvl>
+    <w:lvl w:ilvl="1" w:tentative="1">
+      <w:start w:val="1"/>
+      <w:numFmt w:val="bullet"/>
+      <w:lvlText w:val="o"/>
+      <w:lvlJc w:val="left"/>
+      <w:pPr>
+        <w:tabs>
+          <w:tab w:val="num" w:pos="1440"/>
+        </w:tabs>
+        <w:ind w:left="1440" w:hanging="360"/>
+      </w:pPr>
+      <w:rPr>
+        <w:rFonts w:ascii="Courier New" w:hAnsi="Courier New" w:hint="default"/>
+        <w:sz w:val="20"/>
+      </w:rPr>
+    </w:lvl>
+    <w:lvl w:ilvl="2" w:tentative="1">
+      <w:start w:val="1"/>
+      <w:numFmt w:val="bullet"/>
+      <w:lvlText w:val=""/>
+      <w:lvlJc w:val="left"/>
+      <w:pPr>
+        <w:tabs>
+          <w:tab w:val="num" w:pos="2160"/>
+        </w:tabs>
+        <w:ind w:left="2160" w:hanging="360"/>
+      </w:pPr>
+      <w:rPr>
+        <w:rFonts w:ascii="Wingdings" w:hAnsi="Wingdings" w:hint="default"/>
+        <w:sz w:val="20"/>
+      </w:rPr>
+    </w:lvl>
+    <w:lvl w:ilvl="3" w:tentative="1">
+      <w:start w:val="1"/>
+      <w:numFmt w:val="bullet"/>
+      <w:lvlText w:val=""/>
+      <w:lvlJc w:val="left"/>
+      <w:pPr>
+        <w:tabs>
+          <w:tab w:val="num" w:pos="2880"/>
+        </w:tabs>
+        <w:ind w:left="2880" w:hanging="360"/>
+      </w:pPr>
+      <w:rPr>
+        <w:rFonts w:ascii="Wingdings" w:hAnsi="Wingdings" w:hint="default"/>
+        <w:sz w:val="20"/>
+      </w:rPr>
+    </w:lvl>
+    <w:lvl w:ilvl="4" w:tentative="1">
+      <w:start w:val="1"/>
+      <w:numFmt w:val="bullet"/>
+      <w:lvlText w:val=""/>
+      <w:lvlJc w:val="left"/>
+      <w:pPr>
+        <w:tabs>
+          <w:tab w:val="num" w:pos="3600"/>
+        </w:tabs>
+        <w:ind w:left="3600" w:hanging="360"/>
+      </w:pPr>
+      <w:rPr>
+        <w:rFonts w:ascii="Wingdings" w:hAnsi="Wingdings" w:hint="default"/>
+        <w:sz w:val="20"/>
+      </w:rPr>
+    </w:lvl>
+    <w:lvl w:ilvl="5" w:tentative="1">
+      <w:start w:val="1"/>
+      <w:numFmt w:val="bullet"/>
+      <w:lvlText w:val=""/>
+      <w:lvlJc w:val="left"/>
+      <w:pPr>
+        <w:tabs>
+          <w:tab w:val="num" w:pos="4320"/>
+        </w:tabs>
+        <w:ind w:left="4320" w:hanging="360"/>
+      </w:pPr>
+      <w:rPr>
+        <w:rFonts w:ascii="Wingdings" w:hAnsi="Wingdings" w:hint="default"/>
+        <w:sz w:val="20"/>
+      </w:rPr>
+    </w:lvl>
+    <w:lvl w:ilvl="6" w:tentative="1">
+      <w:start w:val="1"/>
+      <w:numFmt w:val="bullet"/>
+      <w:lvlText w:val=""/>
+      <w:lvlJc w:val="left"/>
+      <w:pPr>
+        <w:tabs>
+          <w:tab w:val="num" w:pos="5040"/>
+        </w:tabs>
+        <w:ind w:left="5040" w:hanging="360"/>
+      </w:pPr>
+      <w:rPr>
+        <w:rFonts w:ascii="Wingdings" w:hAnsi="Wingdings" w:hint="default"/>
+        <w:sz w:val="20"/>
+      </w:rPr>
+    </w:lvl>
+    <w:lvl w:ilvl="7" w:tentative="1">
+      <w:start w:val="1"/>
+      <w:numFmt w:val="bullet"/>
+      <w:lvlText w:val=""/>
+      <w:lvlJc w:val="left"/>
+      <w:pPr>
+        <w:tabs>
+          <w:tab w:val="num" w:pos="5760"/>
+        </w:tabs>
+        <w:ind w:left="5760" w:hanging="360"/>
+      </w:pPr>
+      <w:rPr>
+        <w:rFonts w:ascii="Wingdings" w:hAnsi="Wingdings" w:hint="default"/>
+        <w:sz w:val="20"/>
+      </w:rPr>
+    </w:lvl>
+    <w:lvl w:ilvl="8" w:tentative="1">
+      <w:start w:val="1"/>
+      <w:numFmt w:val="bullet"/>
+      <w:lvlText w:val=""/>
+      <w:lvlJc w:val="left"/>
+      <w:pPr>
+        <w:tabs>
+          <w:tab w:val="num" w:pos="6480"/>
+        </w:tabs>
+        <w:ind w:left="6480" w:hanging="360"/>
+      </w:pPr>
+      <w:rPr>
+        <w:rFonts w:ascii="Wingdings" w:hAnsi="Wingdings" w:hint="default"/>
+        <w:sz w:val="20"/>
+      </w:rPr>
+    </w:lvl>
+  </w:abstractNum>
+  <w:abstractNum w:abstractNumId="17" w15:restartNumberingAfterBreak="0">
+    <w:nsid w:val="538D116E"/>
+    <w:multiLevelType w:val="multilevel"/>
+    <w:tmpl w:val="AF1C6498"/>
+    <w:lvl w:ilvl="0">
+      <w:start w:val="1"/>
+      <w:numFmt w:val="bullet"/>
+      <w:lvlText w:val=""/>
+      <w:lvlJc w:val="left"/>
+      <w:pPr>
+        <w:tabs>
+          <w:tab w:val="num" w:pos="720"/>
+        </w:tabs>
+        <w:ind w:left="720" w:hanging="360"/>
+      </w:pPr>
+      <w:rPr>
+        <w:rFonts w:ascii="Symbol" w:hAnsi="Symbol" w:hint="default"/>
+        <w:sz w:val="20"/>
+      </w:rPr>
+    </w:lvl>
+    <w:lvl w:ilvl="1" w:tentative="1">
+      <w:start w:val="1"/>
+      <w:numFmt w:val="bullet"/>
+      <w:lvlText w:val="o"/>
+      <w:lvlJc w:val="left"/>
+      <w:pPr>
+        <w:tabs>
+          <w:tab w:val="num" w:pos="1440"/>
+        </w:tabs>
+        <w:ind w:left="1440" w:hanging="360"/>
+      </w:pPr>
+      <w:rPr>
+        <w:rFonts w:ascii="Courier New" w:hAnsi="Courier New" w:hint="default"/>
+        <w:sz w:val="20"/>
+      </w:rPr>
+    </w:lvl>
+    <w:lvl w:ilvl="2" w:tentative="1">
+      <w:start w:val="1"/>
+      <w:numFmt w:val="bullet"/>
+      <w:lvlText w:val=""/>
+      <w:lvlJc w:val="left"/>
+      <w:pPr>
+        <w:tabs>
+          <w:tab w:val="num" w:pos="2160"/>
+        </w:tabs>
+        <w:ind w:left="2160" w:hanging="360"/>
+      </w:pPr>
+      <w:rPr>
+        <w:rFonts w:ascii="Wingdings" w:hAnsi="Wingdings" w:hint="default"/>
+        <w:sz w:val="20"/>
+      </w:rPr>
+    </w:lvl>
+    <w:lvl w:ilvl="3" w:tentative="1">
+      <w:start w:val="1"/>
+      <w:numFmt w:val="bullet"/>
+      <w:lvlText w:val=""/>
+      <w:lvlJc w:val="left"/>
+      <w:pPr>
+        <w:tabs>
+          <w:tab w:val="num" w:pos="2880"/>
+        </w:tabs>
+        <w:ind w:left="2880" w:hanging="360"/>
+      </w:pPr>
+      <w:rPr>
+        <w:rFonts w:ascii="Wingdings" w:hAnsi="Wingdings" w:hint="default"/>
+        <w:sz w:val="20"/>
+      </w:rPr>
+    </w:lvl>
+    <w:lvl w:ilvl="4" w:tentative="1">
+      <w:start w:val="1"/>
+      <w:numFmt w:val="bullet"/>
+      <w:lvlText w:val=""/>
+      <w:lvlJc w:val="left"/>
+      <w:pPr>
+        <w:tabs>
+          <w:tab w:val="num" w:pos="3600"/>
+        </w:tabs>
+        <w:ind w:left="3600" w:hanging="360"/>
+      </w:pPr>
+      <w:rPr>
+        <w:rFonts w:ascii="Wingdings" w:hAnsi="Wingdings" w:hint="default"/>
+        <w:sz w:val="20"/>
+      </w:rPr>
+    </w:lvl>
+    <w:lvl w:ilvl="5" w:tentative="1">
+      <w:start w:val="1"/>
+      <w:numFmt w:val="bullet"/>
+      <w:lvlText w:val=""/>
+      <w:lvlJc w:val="left"/>
+      <w:pPr>
+        <w:tabs>
+          <w:tab w:val="num" w:pos="4320"/>
+        </w:tabs>
+        <w:ind w:left="4320" w:hanging="360"/>
+      </w:pPr>
+      <w:rPr>
+        <w:rFonts w:ascii="Wingdings" w:hAnsi="Wingdings" w:hint="default"/>
+        <w:sz w:val="20"/>
+      </w:rPr>
+    </w:lvl>
+    <w:lvl w:ilvl="6" w:tentative="1">
+      <w:start w:val="1"/>
+      <w:numFmt w:val="bullet"/>
+      <w:lvlText w:val=""/>
+      <w:lvlJc w:val="left"/>
+      <w:pPr>
+        <w:tabs>
+          <w:tab w:val="num" w:pos="5040"/>
+        </w:tabs>
+        <w:ind w:left="5040" w:hanging="360"/>
+      </w:pPr>
+      <w:rPr>
+        <w:rFonts w:ascii="Wingdings" w:hAnsi="Wingdings" w:hint="default"/>
+        <w:sz w:val="20"/>
+      </w:rPr>
+    </w:lvl>
+    <w:lvl w:ilvl="7" w:tentative="1">
+      <w:start w:val="1"/>
+      <w:numFmt w:val="bullet"/>
+      <w:lvlText w:val=""/>
+      <w:lvlJc w:val="left"/>
+      <w:pPr>
+        <w:tabs>
+          <w:tab w:val="num" w:pos="5760"/>
+        </w:tabs>
+        <w:ind w:left="5760" w:hanging="360"/>
+      </w:pPr>
+      <w:rPr>
+        <w:rFonts w:ascii="Wingdings" w:hAnsi="Wingdings" w:hint="default"/>
+        <w:sz w:val="20"/>
+      </w:rPr>
+    </w:lvl>
+    <w:lvl w:ilvl="8" w:tentative="1">
+      <w:start w:val="1"/>
+      <w:numFmt w:val="bullet"/>
+      <w:lvlText w:val=""/>
+      <w:lvlJc w:val="left"/>
+      <w:pPr>
+        <w:tabs>
+          <w:tab w:val="num" w:pos="6480"/>
+        </w:tabs>
+        <w:ind w:left="6480" w:hanging="360"/>
+      </w:pPr>
+      <w:rPr>
+        <w:rFonts w:ascii="Wingdings" w:hAnsi="Wingdings" w:hint="default"/>
+        <w:sz w:val="20"/>
+      </w:rPr>
+    </w:lvl>
+  </w:abstractNum>
+  <w:abstractNum w:abstractNumId="18" w15:restartNumberingAfterBreak="0">
+    <w:nsid w:val="53E06D72"/>
+    <w:multiLevelType w:val="multilevel"/>
+    <w:tmpl w:val="05F847D6"/>
+    <w:lvl w:ilvl="0">
+      <w:start w:val="1"/>
+      <w:numFmt w:val="bullet"/>
+      <w:lvlText w:val=""/>
+      <w:lvlJc w:val="left"/>
+      <w:pPr>
+        <w:tabs>
+          <w:tab w:val="num" w:pos="720"/>
+        </w:tabs>
+        <w:ind w:left="720" w:hanging="360"/>
+      </w:pPr>
+      <w:rPr>
+        <w:rFonts w:ascii="Symbol" w:hAnsi="Symbol" w:hint="default"/>
+        <w:sz w:val="20"/>
+      </w:rPr>
+    </w:lvl>
+    <w:lvl w:ilvl="1" w:tentative="1">
+      <w:start w:val="1"/>
+      <w:numFmt w:val="bullet"/>
+      <w:lvlText w:val="o"/>
+      <w:lvlJc w:val="left"/>
+      <w:pPr>
+        <w:tabs>
+          <w:tab w:val="num" w:pos="1440"/>
+        </w:tabs>
+        <w:ind w:left="1440" w:hanging="360"/>
+      </w:pPr>
+      <w:rPr>
+        <w:rFonts w:ascii="Courier New" w:hAnsi="Courier New" w:hint="default"/>
+        <w:sz w:val="20"/>
+      </w:rPr>
+    </w:lvl>
+    <w:lvl w:ilvl="2" w:tentative="1">
+      <w:start w:val="1"/>
+      <w:numFmt w:val="bullet"/>
+      <w:lvlText w:val=""/>
+      <w:lvlJc w:val="left"/>
+      <w:pPr>
+        <w:tabs>
+          <w:tab w:val="num" w:pos="2160"/>
+        </w:tabs>
+        <w:ind w:left="2160" w:hanging="360"/>
+      </w:pPr>
+      <w:rPr>
+        <w:rFonts w:ascii="Wingdings" w:hAnsi="Wingdings" w:hint="default"/>
+        <w:sz w:val="20"/>
+      </w:rPr>
+    </w:lvl>
+    <w:lvl w:ilvl="3" w:tentative="1">
+      <w:start w:val="1"/>
+      <w:numFmt w:val="bullet"/>
+      <w:lvlText w:val=""/>
+      <w:lvlJc w:val="left"/>
+      <w:pPr>
+        <w:tabs>
+          <w:tab w:val="num" w:pos="2880"/>
+        </w:tabs>
+        <w:ind w:left="2880" w:hanging="360"/>
+      </w:pPr>
+      <w:rPr>
+        <w:rFonts w:ascii="Wingdings" w:hAnsi="Wingdings" w:hint="default"/>
+        <w:sz w:val="20"/>
+      </w:rPr>
+    </w:lvl>
+    <w:lvl w:ilvl="4" w:tentative="1">
+      <w:start w:val="1"/>
+      <w:numFmt w:val="bullet"/>
+      <w:lvlText w:val=""/>
+      <w:lvlJc w:val="left"/>
+      <w:pPr>
+        <w:tabs>
+          <w:tab w:val="num" w:pos="3600"/>
+        </w:tabs>
+        <w:ind w:left="3600" w:hanging="360"/>
+      </w:pPr>
+      <w:rPr>
+        <w:rFonts w:ascii="Wingdings" w:hAnsi="Wingdings" w:hint="default"/>
+        <w:sz w:val="20"/>
+      </w:rPr>
+    </w:lvl>
+    <w:lvl w:ilvl="5" w:tentative="1">
+      <w:start w:val="1"/>
+      <w:numFmt w:val="bullet"/>
+      <w:lvlText w:val=""/>
+      <w:lvlJc w:val="left"/>
+      <w:pPr>
+        <w:tabs>
+          <w:tab w:val="num" w:pos="4320"/>
+        </w:tabs>
+        <w:ind w:left="4320" w:hanging="360"/>
+      </w:pPr>
+      <w:rPr>
+        <w:rFonts w:ascii="Wingdings" w:hAnsi="Wingdings" w:hint="default"/>
+        <w:sz w:val="20"/>
+      </w:rPr>
+    </w:lvl>
+    <w:lvl w:ilvl="6" w:tentative="1">
+      <w:start w:val="1"/>
+      <w:numFmt w:val="bullet"/>
+      <w:lvlText w:val=""/>
+      <w:lvlJc w:val="left"/>
+      <w:pPr>
+        <w:tabs>
+          <w:tab w:val="num" w:pos="5040"/>
+        </w:tabs>
+        <w:ind w:left="5040" w:hanging="360"/>
+      </w:pPr>
+      <w:rPr>
+        <w:rFonts w:ascii="Wingdings" w:hAnsi="Wingdings" w:hint="default"/>
+        <w:sz w:val="20"/>
+      </w:rPr>
+    </w:lvl>
+    <w:lvl w:ilvl="7" w:tentative="1">
+      <w:start w:val="1"/>
+      <w:numFmt w:val="bullet"/>
+      <w:lvlText w:val=""/>
+      <w:lvlJc w:val="left"/>
+      <w:pPr>
+        <w:tabs>
+          <w:tab w:val="num" w:pos="5760"/>
+        </w:tabs>
+        <w:ind w:left="5760" w:hanging="360"/>
+      </w:pPr>
+      <w:rPr>
+        <w:rFonts w:ascii="Wingdings" w:hAnsi="Wingdings" w:hint="default"/>
+        <w:sz w:val="20"/>
+      </w:rPr>
+    </w:lvl>
+    <w:lvl w:ilvl="8" w:tentative="1">
+      <w:start w:val="1"/>
+      <w:numFmt w:val="bullet"/>
+      <w:lvlText w:val=""/>
+      <w:lvlJc w:val="left"/>
+      <w:pPr>
+        <w:tabs>
+          <w:tab w:val="num" w:pos="6480"/>
+        </w:tabs>
+        <w:ind w:left="6480" w:hanging="360"/>
+      </w:pPr>
+      <w:rPr>
+        <w:rFonts w:ascii="Wingdings" w:hAnsi="Wingdings" w:hint="default"/>
+        <w:sz w:val="20"/>
+      </w:rPr>
+    </w:lvl>
+  </w:abstractNum>
+  <w:abstractNum w:abstractNumId="19" w15:restartNumberingAfterBreak="0">
+    <w:nsid w:val="561F2F9A"/>
+    <w:multiLevelType w:val="multilevel"/>
+    <w:tmpl w:val="CD74528E"/>
+    <w:lvl w:ilvl="0">
+      <w:start w:val="1"/>
+      <w:numFmt w:val="bullet"/>
+      <w:lvlText w:val=""/>
+      <w:lvlJc w:val="left"/>
+      <w:pPr>
+        <w:tabs>
+          <w:tab w:val="num" w:pos="720"/>
+        </w:tabs>
+        <w:ind w:left="720" w:hanging="360"/>
+      </w:pPr>
+      <w:rPr>
+        <w:rFonts w:ascii="Symbol" w:hAnsi="Symbol" w:hint="default"/>
+        <w:sz w:val="20"/>
+      </w:rPr>
+    </w:lvl>
+    <w:lvl w:ilvl="1" w:tentative="1">
+      <w:start w:val="1"/>
+      <w:numFmt w:val="bullet"/>
+      <w:lvlText w:val="o"/>
+      <w:lvlJc w:val="left"/>
+      <w:pPr>
+        <w:tabs>
+          <w:tab w:val="num" w:pos="1440"/>
+        </w:tabs>
+        <w:ind w:left="1440" w:hanging="360"/>
+      </w:pPr>
+      <w:rPr>
+        <w:rFonts w:ascii="Courier New" w:hAnsi="Courier New" w:hint="default"/>
+        <w:sz w:val="20"/>
+      </w:rPr>
+    </w:lvl>
+    <w:lvl w:ilvl="2" w:tentative="1">
+      <w:start w:val="1"/>
+      <w:numFmt w:val="bullet"/>
+      <w:lvlText w:val=""/>
+      <w:lvlJc w:val="left"/>
+      <w:pPr>
+        <w:tabs>
+          <w:tab w:val="num" w:pos="2160"/>
+        </w:tabs>
+        <w:ind w:left="2160" w:hanging="360"/>
+      </w:pPr>
+      <w:rPr>
+        <w:rFonts w:ascii="Wingdings" w:hAnsi="Wingdings" w:hint="default"/>
+        <w:sz w:val="20"/>
+      </w:rPr>
+    </w:lvl>
+    <w:lvl w:ilvl="3" w:tentative="1">
+      <w:start w:val="1"/>
+      <w:numFmt w:val="bullet"/>
+      <w:lvlText w:val=""/>
+      <w:lvlJc w:val="left"/>
+      <w:pPr>
+        <w:tabs>
+          <w:tab w:val="num" w:pos="2880"/>
+        </w:tabs>
+        <w:ind w:left="2880" w:hanging="360"/>
+      </w:pPr>
+      <w:rPr>
+        <w:rFonts w:ascii="Wingdings" w:hAnsi="Wingdings" w:hint="default"/>
+        <w:sz w:val="20"/>
+      </w:rPr>
+    </w:lvl>
+    <w:lvl w:ilvl="4" w:tentative="1">
+      <w:start w:val="1"/>
+      <w:numFmt w:val="bullet"/>
+      <w:lvlText w:val=""/>
+      <w:lvlJc w:val="left"/>
+      <w:pPr>
+        <w:tabs>
+          <w:tab w:val="num" w:pos="3600"/>
+        </w:tabs>
+        <w:ind w:left="3600" w:hanging="360"/>
+      </w:pPr>
+      <w:rPr>
+        <w:rFonts w:ascii="Wingdings" w:hAnsi="Wingdings" w:hint="default"/>
+        <w:sz w:val="20"/>
+      </w:rPr>
+    </w:lvl>
+    <w:lvl w:ilvl="5" w:tentative="1">
+      <w:start w:val="1"/>
+      <w:numFmt w:val="bullet"/>
+      <w:lvlText w:val=""/>
+      <w:lvlJc w:val="left"/>
+      <w:pPr>
+        <w:tabs>
+          <w:tab w:val="num" w:pos="4320"/>
+        </w:tabs>
+        <w:ind w:left="4320" w:hanging="360"/>
+      </w:pPr>
+      <w:rPr>
+        <w:rFonts w:ascii="Wingdings" w:hAnsi="Wingdings" w:hint="default"/>
+        <w:sz w:val="20"/>
+      </w:rPr>
+    </w:lvl>
+    <w:lvl w:ilvl="6" w:tentative="1">
+      <w:start w:val="1"/>
+      <w:numFmt w:val="bullet"/>
+      <w:lvlText w:val=""/>
+      <w:lvlJc w:val="left"/>
+      <w:pPr>
+        <w:tabs>
+          <w:tab w:val="num" w:pos="5040"/>
+        </w:tabs>
+        <w:ind w:left="5040" w:hanging="360"/>
+      </w:pPr>
+      <w:rPr>
+        <w:rFonts w:ascii="Wingdings" w:hAnsi="Wingdings" w:hint="default"/>
+        <w:sz w:val="20"/>
+      </w:rPr>
+    </w:lvl>
+    <w:lvl w:ilvl="7" w:tentative="1">
+      <w:start w:val="1"/>
+      <w:numFmt w:val="bullet"/>
+      <w:lvlText w:val=""/>
+      <w:lvlJc w:val="left"/>
+      <w:pPr>
+        <w:tabs>
+          <w:tab w:val="num" w:pos="5760"/>
+        </w:tabs>
+        <w:ind w:left="5760" w:hanging="360"/>
+      </w:pPr>
+      <w:rPr>
+        <w:rFonts w:ascii="Wingdings" w:hAnsi="Wingdings" w:hint="default"/>
+        <w:sz w:val="20"/>
+      </w:rPr>
+    </w:lvl>
+    <w:lvl w:ilvl="8" w:tentative="1">
+      <w:start w:val="1"/>
+      <w:numFmt w:val="bullet"/>
+      <w:lvlText w:val=""/>
+      <w:lvlJc w:val="left"/>
+      <w:pPr>
+        <w:tabs>
+          <w:tab w:val="num" w:pos="6480"/>
+        </w:tabs>
+        <w:ind w:left="6480" w:hanging="360"/>
+      </w:pPr>
+      <w:rPr>
+        <w:rFonts w:ascii="Wingdings" w:hAnsi="Wingdings" w:hint="default"/>
+        <w:sz w:val="20"/>
       </w:rPr>
     </w:lvl>
   </w:abstractNum>
@@ -1663,6 +4413,39 @@
   </w:num>
   <w:num w:numId="9" w16cid:durableId="1473788722">
     <w:abstractNumId w:val="0"/>
+  </w:num>
+  <w:num w:numId="10" w16cid:durableId="503472679">
+    <w:abstractNumId w:val="12"/>
+  </w:num>
+  <w:num w:numId="11" w16cid:durableId="848444473">
+    <w:abstractNumId w:val="18"/>
+  </w:num>
+  <w:num w:numId="12" w16cid:durableId="750857834">
+    <w:abstractNumId w:val="13"/>
+  </w:num>
+  <w:num w:numId="13" w16cid:durableId="1141653836">
+    <w:abstractNumId w:val="17"/>
+  </w:num>
+  <w:num w:numId="14" w16cid:durableId="1322738896">
+    <w:abstractNumId w:val="16"/>
+  </w:num>
+  <w:num w:numId="15" w16cid:durableId="1074088895">
+    <w:abstractNumId w:val="19"/>
+  </w:num>
+  <w:num w:numId="16" w16cid:durableId="181209440">
+    <w:abstractNumId w:val="10"/>
+  </w:num>
+  <w:num w:numId="17" w16cid:durableId="92094301">
+    <w:abstractNumId w:val="14"/>
+  </w:num>
+  <w:num w:numId="18" w16cid:durableId="474690045">
+    <w:abstractNumId w:val="9"/>
+  </w:num>
+  <w:num w:numId="19" w16cid:durableId="1288657676">
+    <w:abstractNumId w:val="15"/>
+  </w:num>
+  <w:num w:numId="20" w16cid:durableId="789788823">
+    <w:abstractNumId w:val="11"/>
   </w:num>
 </w:numbering>
 </file>
@@ -2270,7 +5053,6 @@
   <w:style w:type="character" w:default="1" w:styleId="Bekezdsalapbettpusa">
     <w:name w:val="Default Paragraph Font"/>
     <w:uiPriority w:val="1"/>
-    <w:semiHidden/>
     <w:unhideWhenUsed/>
   </w:style>
   <w:style w:type="table" w:default="1" w:styleId="Normltblzat">

</xml_diff>